<commit_message>
slides - ui fix E2 visão - reviwed up to 1.2
</commit_message>
<xml_diff>
--- a/docs/E2 Visão - MobiAssiste.docx
+++ b/docs/E2 Visão - MobiAssiste.docx
@@ -2,32 +2,32 @@
 <file path=word/document.xml><?xml version="1.0" encoding="utf-8"?>
 <w:document xmlns:o="urn:schemas-microsoft-com:office:office" xmlns:r="http://schemas.openxmlformats.org/officeDocument/2006/relationships" xmlns:v="urn:schemas-microsoft-com:vml" xmlns:w="http://schemas.openxmlformats.org/wordprocessingml/2006/main" xmlns:w10="urn:schemas-microsoft-com:office:word" xmlns:wp="http://schemas.openxmlformats.org/drawingml/2006/wordprocessingDrawing" xmlns:wps="http://schemas.microsoft.com/office/word/2010/wordprocessingShape" xmlns:wpg="http://schemas.microsoft.com/office/word/2010/wordprocessingGroup" xmlns:mc="http://schemas.openxmlformats.org/markup-compatibility/2006" xmlns:wp14="http://schemas.microsoft.com/office/word/2010/wordprocessingDrawing" xmlns:w14="http://schemas.microsoft.com/office/word/2010/wordml" xmlns:w15="http://schemas.microsoft.com/office/word/2012/wordml" mc:Ignorable="w14 wp14 w15">
   <w:body>
-    <w:p>
+    <w:p xmlns:wp14="http://schemas.microsoft.com/office/word/2010/wordml" wp14:textId="77777777">
       <w:pPr>
         <w:pStyle w:val="Title"/>
         <w:spacing w:before="480" w:after="120"/>
         <w:rPr/>
       </w:pPr>
-      <w:bookmarkStart w:id="0" w:name="_k4wrxj4vz2qz"/>
+      <w:bookmarkStart w:name="_k4wrxj4vz2qz" w:id="0"/>
       <w:bookmarkEnd w:id="0"/>
       <w:r>
         <w:rPr/>
         <w:t>Relatório de Visão (E2)</w:t>
       </w:r>
     </w:p>
-    <w:p>
+    <w:p xmlns:wp14="http://schemas.microsoft.com/office/word/2010/wordml" wp14:textId="77777777">
       <w:pPr>
         <w:pStyle w:val="Heading1"/>
         <w:rPr/>
       </w:pPr>
-      <w:bookmarkStart w:id="1" w:name="_yg0yb0fc5n1g"/>
+      <w:bookmarkStart w:name="_yg0yb0fc5n1g" w:id="1"/>
       <w:bookmarkEnd w:id="1"/>
       <w:r>
         <w:rPr/>
         <w:t>Plataforma Digital de Gestão Integrada de Mobilidade Assistida (MobiAssiste)</w:t>
       </w:r>
     </w:p>
-    <w:p>
+    <w:p xmlns:wp14="http://schemas.microsoft.com/office/word/2010/wordml" wp14:textId="77777777">
       <w:pPr>
         <w:pStyle w:val="normal1"/>
         <w:rPr/>
@@ -42,6 +42,9 @@
       <w:r>
         <w:rPr/>
         <w:t xml:space="preserve"> Plataforma Digital de Gestão Integrada de Mobilidade Assistida (MobiAssiste)</w:t>
+      </w:r>
+      <w:r>
+        <w:rPr/>
         <w:br/>
       </w:r>
       <w:r>
@@ -54,6 +57,9 @@
       <w:r>
         <w:rPr/>
         <w:t xml:space="preserve"> Dinis Carvalho [125804], Hugo Lopes [119012], Inês Cardoso [125738], Guilherme Costa [125636]</w:t>
+      </w:r>
+      <w:r>
+        <w:rPr/>
         <w:br/>
       </w:r>
       <w:r>
@@ -68,63 +74,94 @@
         <w:t xml:space="preserve"> 09/10/2026, v2</w:t>
       </w:r>
     </w:p>
-    <w:p>
+    <w:p xmlns:wp14="http://schemas.microsoft.com/office/word/2010/wordml" wp14:textId="77777777">
       <w:pPr>
         <w:pStyle w:val="Heading2"/>
         <w:rPr/>
       </w:pPr>
-      <w:bookmarkStart w:id="2" w:name="_fymgnwnlx97l"/>
+      <w:bookmarkStart w:name="_fymgnwnlx97l" w:id="2"/>
       <w:bookmarkEnd w:id="2"/>
       <w:r>
         <w:rPr/>
         <w:t>Sumário Executivo</w:t>
       </w:r>
     </w:p>
-    <w:p>
-      <w:pPr>
-        <w:pStyle w:val="normal1"/>
-        <w:rPr/>
-      </w:pPr>
-      <w:r>
-        <w:rPr/>
-        <w:t>O presente documento especifica o Relatório de Visão para o desenvolvimento da plataforma digital de Gestão Integrada de Mobilidade Assistida (MobiAssiste). A solução visa conectar pessoas idosas ou com mobilidade reduzida a voluntários, frotas adaptadas de parceiros e operadores profissionais para o transporte e acompanhamento em consultas médicas não urgentes e exames. São apresentados a caraterização do promotor (IPSS/Rede Municipal), a análise de stakeholders e personas, o posicionamento estratégico, a definição dos novos processos digitais (To-Be) e o roadmap de desenvolvimento estruturado em épicos.</w:t>
-      </w:r>
-    </w:p>
-    <w:p>
+    <w:p xmlns:wp14="http://schemas.microsoft.com/office/word/2010/wordml" wp14:textId="7DE8F6DA">
+      <w:pPr>
+        <w:pStyle w:val="normal1"/>
+        <w:suppressLineNumbers w:val="0"/>
+        <w:bidi w:val="0"/>
+        <w:spacing w:before="0" w:beforeAutospacing="off" w:after="0" w:afterAutospacing="off" w:line="333" w:lineRule="auto"/>
+        <w:ind w:left="0" w:right="0"/>
+        <w:jc w:val="left"/>
+      </w:pPr>
+      <w:r>
+        <w:rPr>
+          <w:lang w:val="en-US"/>
+        </w:rPr>
+        <w:t>O presente documento apresenta o Relatório de Visão para o desenvolvimento da plataforma digital de Gestão Integrada de Mobilidade Assistida (</w:t>
+      </w:r>
+      <w:r>
+        <w:rPr>
+          <w:lang w:val="en-US"/>
+        </w:rPr>
+        <w:t>MobiAssiste</w:t>
+      </w:r>
+      <w:r>
+        <w:rPr>
+          <w:lang w:val="en-US"/>
+        </w:rPr>
+        <w:t>). A solução pretende conectar pessoas idosas ou com mobilidade reduzida a voluntários, frotas adaptadas de parceiros e operadores profissionais para o transporte e acompanhamento em consultas médicas não urgentes e exames. São apresentados a caraterização do promotor (IPSS/Rede Municipal), a análise de stakeholders e personas, o posicionamento estratégico, a definição dos novos processos digitais (To-Be) e o roadmap de desenvolvimento estruturado em épicos.</w:t>
+      </w:r>
+    </w:p>
+    <w:p xmlns:wp14="http://schemas.microsoft.com/office/word/2010/wordml" wp14:textId="77777777">
       <w:pPr>
         <w:pStyle w:val="Heading1"/>
         <w:rPr/>
       </w:pPr>
-      <w:bookmarkStart w:id="3" w:name="_bl3b0nfawqg5"/>
+      <w:bookmarkStart w:name="_bl3b0nfawqg5" w:id="3"/>
       <w:bookmarkEnd w:id="3"/>
       <w:r>
         <w:rPr/>
         <w:t>1. Introdução</w:t>
       </w:r>
     </w:p>
-    <w:p>
+    <w:p xmlns:wp14="http://schemas.microsoft.com/office/word/2010/wordml" wp14:textId="77777777">
       <w:pPr>
         <w:pStyle w:val="Heading2"/>
         <w:rPr/>
       </w:pPr>
-      <w:bookmarkStart w:id="4" w:name="_qhz9242syswz"/>
+      <w:bookmarkStart w:name="_qhz9242syswz" w:id="4"/>
       <w:bookmarkEnd w:id="4"/>
       <w:r>
         <w:rPr/>
         <w:t>1.1. Enquadramento e Âmbito</w:t>
       </w:r>
     </w:p>
-    <w:p>
-      <w:pPr>
-        <w:pStyle w:val="normal1"/>
-        <w:rPr/>
-      </w:pPr>
-      <w:r>
-        <w:rPr/>
-        <w:t>Este relatório apresenta uma proposta para a introdução de novos serviços digitais, promovida por uma Instituição Particular de Solidariedade Social (IPSS) em parceria com a Rede Municipal de Apoio Social, em resposta à crescente dificuldade de acesso a cuidados de saúde por parte de populações seniores e vulneráveis (isolamento social, incapacidade motora e limitações no transporte público tradicional).</w:t>
-      </w:r>
-    </w:p>
-    <w:p>
+    <w:p xmlns:wp14="http://schemas.microsoft.com/office/word/2010/wordml" wp14:textId="404E8340">
+      <w:pPr>
+        <w:pStyle w:val="normal1"/>
+      </w:pPr>
+      <w:r>
+        <w:rPr>
+          <w:lang w:val="en-US"/>
+        </w:rPr>
+        <w:t xml:space="preserve">Este relatório apresenta uma proposta para a introdução </w:t>
+      </w:r>
+      <w:r>
+        <w:rPr>
+          <w:lang w:val="en-US"/>
+        </w:rPr>
+        <w:t xml:space="preserve">de </w:t>
+      </w:r>
+      <w:r>
+        <w:rPr>
+          <w:lang w:val="en-US"/>
+        </w:rPr>
+        <w:t>novos serviços digitais, promovida por uma Instituição Particular de Solidariedade Social (IPSS) em parceria com a Rede Municipal de Apoio Social, em resposta à crescente dificuldade de acesso a cuidados de saúde por parte de populações seniores e vulneráveis (isolamento social, incapacidade motora e limitações no transporte público tradicional).</w:t>
+      </w:r>
+    </w:p>
+    <w:p xmlns:wp14="http://schemas.microsoft.com/office/word/2010/wordml" wp14:textId="77777777">
       <w:pPr>
         <w:pStyle w:val="normal1"/>
         <w:keepNext w:val="false"/>
@@ -133,8 +170,8 @@
         <w:widowControl w:val="false"/>
         <w:pBdr/>
         <w:shd w:val="clear" w:fill="auto"/>
-        <w:spacing w:lineRule="auto" w:line="276" w:before="0" w:after="0"/>
-        <w:ind w:hanging="0" w:left="0" w:right="0"/>
+        <w:spacing w:before="0" w:after="0" w:line="276" w:lineRule="auto"/>
+        <w:ind w:left="0" w:right="0" w:hanging="0"/>
         <w:jc w:val="left"/>
         <w:rPr/>
       </w:pPr>
@@ -142,7 +179,7 @@
         <w:rPr/>
       </w:r>
     </w:p>
-    <w:p>
+    <w:p xmlns:wp14="http://schemas.microsoft.com/office/word/2010/wordml" wp14:textId="77777777">
       <w:pPr>
         <w:pStyle w:val="normal1"/>
         <w:rPr/>
@@ -152,19 +189,19 @@
         <w:t>A organização visa, com o novo sistema, criar um modelo híbrido e integrado de mobilidade assistida que garanta o acompanhamento "porta-a-porta" para consultas e exames. Para isso, foi identificada a necessidade de desenvolver uma plataforma digital centralizada composta por uma aplicação móvel para voluntários, um portal web de coordenação para parceiros/IPSS clientes e canais assistidos (atendimento telefónico/familiar).</w:t>
       </w:r>
     </w:p>
-    <w:p>
+    <w:p xmlns:wp14="http://schemas.microsoft.com/office/word/2010/wordml" wp14:textId="77777777">
       <w:pPr>
         <w:pStyle w:val="Heading2"/>
         <w:rPr/>
       </w:pPr>
-      <w:bookmarkStart w:id="5" w:name="_urlq4h5ctooz"/>
+      <w:bookmarkStart w:name="_urlq4h5ctooz" w:id="5"/>
       <w:bookmarkEnd w:id="5"/>
       <w:r>
         <w:rPr/>
         <w:t>1.2. Metodologia de Levantamento de Informação</w:t>
       </w:r>
     </w:p>
-    <w:p>
+    <w:p xmlns:wp14="http://schemas.microsoft.com/office/word/2010/wordml" wp14:textId="77777777">
       <w:pPr>
         <w:pStyle w:val="normal1"/>
         <w:rPr/>
@@ -174,7 +211,7 @@
         <w:t>A estratégia de levantamento de informação baseou-se em três pilares fundamentais:</w:t>
       </w:r>
     </w:p>
-    <w:p>
+    <w:p xmlns:wp14="http://schemas.microsoft.com/office/word/2010/wordml" wp14:textId="77777777">
       <w:pPr>
         <w:pStyle w:val="normal1"/>
         <w:keepNext w:val="false"/>
@@ -183,8 +220,8 @@
         <w:widowControl w:val="false"/>
         <w:pBdr/>
         <w:shd w:val="clear" w:fill="auto"/>
-        <w:spacing w:lineRule="auto" w:line="276" w:before="0" w:after="0"/>
-        <w:ind w:hanging="0" w:left="0" w:right="0"/>
+        <w:spacing w:before="0" w:after="0" w:line="276" w:lineRule="auto"/>
+        <w:ind w:left="0" w:right="0" w:hanging="0"/>
         <w:jc w:val="left"/>
         <w:rPr/>
       </w:pPr>
@@ -192,14 +229,14 @@
         <w:rPr/>
       </w:r>
     </w:p>
-    <w:p>
+    <w:p xmlns:wp14="http://schemas.microsoft.com/office/word/2010/wordml" wp14:textId="77777777">
       <w:pPr>
         <w:pStyle w:val="normal1"/>
         <w:numPr>
           <w:ilvl w:val="0"/>
           <w:numId w:val="3"/>
         </w:numPr>
-        <w:ind w:hanging="360" w:left="720"/>
+        <w:ind w:left="720" w:hanging="360"/>
         <w:rPr/>
       </w:pPr>
       <w:r>
@@ -225,14 +262,14 @@
         <w:t>.</w:t>
       </w:r>
     </w:p>
-    <w:p>
+    <w:p xmlns:wp14="http://schemas.microsoft.com/office/word/2010/wordml" wp14:textId="77777777">
       <w:pPr>
         <w:pStyle w:val="normal1"/>
         <w:numPr>
           <w:ilvl w:val="0"/>
           <w:numId w:val="3"/>
         </w:numPr>
-        <w:ind w:hanging="360" w:left="720"/>
+        <w:ind w:left="720" w:hanging="360"/>
         <w:rPr/>
       </w:pPr>
       <w:r>
@@ -247,14 +284,14 @@
         <w:t xml:space="preserve"> Modelação detalhada de perfis de utentes (focando em particularidades como deficiência visual e mobilidade reduzida severa), coordenadores operacionais de IPSS, lares e residências seniores parceiras, e condutores voluntários.</w:t>
       </w:r>
     </w:p>
-    <w:p>
+    <w:p xmlns:wp14="http://schemas.microsoft.com/office/word/2010/wordml" wp14:textId="77777777">
       <w:pPr>
         <w:pStyle w:val="normal1"/>
         <w:numPr>
           <w:ilvl w:val="0"/>
           <w:numId w:val="3"/>
         </w:numPr>
-        <w:ind w:hanging="360" w:left="720"/>
+        <w:ind w:left="720" w:hanging="360"/>
         <w:rPr/>
       </w:pPr>
       <w:r>
@@ -269,19 +306,19 @@
         <w:t xml:space="preserve"> Mapeamento do fluxo operacional atual, identificando tempos mortos de espera hospitalar e a fragilidade na coordenação de meios heterogéneos (veículos próprios de voluntários, viaturas adaptadas de instituições e frotas de táxis/TVDE de recurso).</w:t>
       </w:r>
     </w:p>
-    <w:p>
+    <w:p xmlns:wp14="http://schemas.microsoft.com/office/word/2010/wordml" wp14:textId="77777777">
       <w:pPr>
         <w:pStyle w:val="Heading2"/>
         <w:rPr/>
       </w:pPr>
-      <w:bookmarkStart w:id="6" w:name="_ktnvzh25wnfe"/>
+      <w:bookmarkStart w:name="_ktnvzh25wnfe" w:id="6"/>
       <w:bookmarkEnd w:id="6"/>
       <w:r>
         <w:rPr/>
         <w:t>1.3. Utilização de Recursos de Inteligência Artificial</w:t>
       </w:r>
     </w:p>
-    <w:p>
+    <w:p xmlns:wp14="http://schemas.microsoft.com/office/word/2010/wordml" wp14:textId="77777777">
       <w:pPr>
         <w:pStyle w:val="normal1"/>
         <w:rPr/>
@@ -291,7 +328,7 @@
         <w:t>Os recursos de Inteligência Artificial Generativa foram integrados na fase de conceção e elaboração documental para:</w:t>
       </w:r>
     </w:p>
-    <w:p>
+    <w:p xmlns:wp14="http://schemas.microsoft.com/office/word/2010/wordml" wp14:textId="77777777">
       <w:pPr>
         <w:pStyle w:val="normal1"/>
         <w:keepNext w:val="false"/>
@@ -300,8 +337,8 @@
         <w:widowControl w:val="false"/>
         <w:pBdr/>
         <w:shd w:val="clear" w:fill="auto"/>
-        <w:spacing w:lineRule="auto" w:line="276" w:before="0" w:after="0"/>
-        <w:ind w:hanging="0" w:left="0" w:right="0"/>
+        <w:spacing w:before="0" w:after="0" w:line="276" w:lineRule="auto"/>
+        <w:ind w:left="0" w:right="0" w:hanging="0"/>
         <w:jc w:val="left"/>
         <w:rPr/>
       </w:pPr>
@@ -309,14 +346,14 @@
         <w:rPr/>
       </w:r>
     </w:p>
-    <w:p>
+    <w:p xmlns:wp14="http://schemas.microsoft.com/office/word/2010/wordml" wp14:textId="77777777">
       <w:pPr>
         <w:pStyle w:val="normal1"/>
         <w:numPr>
           <w:ilvl w:val="0"/>
           <w:numId w:val="1"/>
         </w:numPr>
-        <w:ind w:hanging="360" w:left="720"/>
+        <w:ind w:left="720" w:hanging="360"/>
         <w:rPr/>
       </w:pPr>
       <w:r>
@@ -324,14 +361,14 @@
         <w:t>Apoiar a estruturação, expansão e síntese dos textos explicativos com base nas especificações conceituais do projeto;</w:t>
       </w:r>
     </w:p>
-    <w:p>
+    <w:p xmlns:wp14="http://schemas.microsoft.com/office/word/2010/wordml" wp14:textId="77777777">
       <w:pPr>
         <w:pStyle w:val="normal1"/>
         <w:numPr>
           <w:ilvl w:val="0"/>
           <w:numId w:val="1"/>
         </w:numPr>
-        <w:ind w:hanging="360" w:left="720"/>
+        <w:ind w:left="720" w:hanging="360"/>
         <w:rPr/>
       </w:pPr>
       <w:r>
@@ -339,14 +376,14 @@
         <w:t>Sistematizar a matriz de alinhamento estratégico, a definição de Indicadores Chave de Desempenho (KPIs) e a consolidação das declarações formais de posicionamento do produto;</w:t>
       </w:r>
     </w:p>
-    <w:p>
+    <w:p xmlns:wp14="http://schemas.microsoft.com/office/word/2010/wordml" wp14:textId="77777777">
       <w:pPr>
         <w:pStyle w:val="normal1"/>
         <w:numPr>
           <w:ilvl w:val="0"/>
           <w:numId w:val="1"/>
         </w:numPr>
-        <w:ind w:hanging="360" w:left="720"/>
+        <w:ind w:left="720" w:hanging="360"/>
         <w:rPr/>
       </w:pPr>
       <w:r>
@@ -365,31 +402,31 @@
         <w:t xml:space="preserve"> entre perfis funcionais de mobilidade e tipologias de veículos/credenciados.</w:t>
       </w:r>
     </w:p>
-    <w:p>
+    <w:p xmlns:wp14="http://schemas.microsoft.com/office/word/2010/wordml" wp14:textId="77777777">
       <w:pPr>
         <w:pStyle w:val="Heading1"/>
         <w:rPr/>
       </w:pPr>
-      <w:bookmarkStart w:id="7" w:name="_uaqxpmjop6ol"/>
+      <w:bookmarkStart w:name="_uaqxpmjop6ol" w:id="7"/>
       <w:bookmarkEnd w:id="7"/>
       <w:r>
         <w:rPr/>
         <w:t>2. Contexto Estratégico do Promotor</w:t>
       </w:r>
     </w:p>
-    <w:p>
+    <w:p xmlns:wp14="http://schemas.microsoft.com/office/word/2010/wordml" wp14:textId="77777777">
       <w:pPr>
         <w:pStyle w:val="Heading2"/>
         <w:rPr/>
       </w:pPr>
-      <w:bookmarkStart w:id="8" w:name="_c3azedgalgbr"/>
+      <w:bookmarkStart w:name="_c3azedgalgbr" w:id="8"/>
       <w:bookmarkEnd w:id="8"/>
       <w:r>
         <w:rPr/>
         <w:t>2.1. Caraterização da Organização</w:t>
       </w:r>
     </w:p>
-    <w:p>
+    <w:p xmlns:wp14="http://schemas.microsoft.com/office/word/2010/wordml" wp14:textId="77777777">
       <w:pPr>
         <w:pStyle w:val="normal1"/>
         <w:rPr/>
@@ -399,7 +436,7 @@
         <w:t>O promotor do projeto é uma IPSS / Rede Municipal de Apoio Social (à imagem de entidades como a APPACDM Aveiro ou os conselhos do CLAS Viseu), tratando-se de uma instituição de solidariedade social de âmbito regional fortemente implantada no setor da Ação Social e Saúde Comunitária.</w:t>
       </w:r>
     </w:p>
-    <w:p>
+    <w:p xmlns:wp14="http://schemas.microsoft.com/office/word/2010/wordml" wp14:textId="77777777">
       <w:pPr>
         <w:pStyle w:val="normal1"/>
         <w:keepNext w:val="false"/>
@@ -408,8 +445,8 @@
         <w:widowControl w:val="false"/>
         <w:pBdr/>
         <w:shd w:val="clear" w:fill="auto"/>
-        <w:spacing w:lineRule="auto" w:line="276" w:before="0" w:after="0"/>
-        <w:ind w:hanging="0" w:left="0" w:right="0"/>
+        <w:spacing w:before="0" w:after="0" w:line="276" w:lineRule="auto"/>
+        <w:ind w:left="0" w:right="0" w:hanging="0"/>
         <w:jc w:val="left"/>
         <w:rPr/>
       </w:pPr>
@@ -417,7 +454,7 @@
         <w:rPr/>
       </w:r>
     </w:p>
-    <w:p>
+    <w:p xmlns:wp14="http://schemas.microsoft.com/office/word/2010/wordml" wp14:textId="77777777">
       <w:pPr>
         <w:pStyle w:val="normal1"/>
         <w:rPr/>
@@ -427,19 +464,19 @@
         <w:t>A entidade serve de suporte diário a pessoas idosas em situação de vulnerabilidade, cidadãos com deficiência ou incapacidade motora e sensorial permanente ou temporária, bem como utentes integrados em lares, centros de dia e estruturas residenciais para idosos (ERPI).</w:t>
       </w:r>
     </w:p>
-    <w:p>
+    <w:p xmlns:wp14="http://schemas.microsoft.com/office/word/2010/wordml" wp14:textId="77777777">
       <w:pPr>
         <w:pStyle w:val="Heading2"/>
         <w:rPr/>
       </w:pPr>
-      <w:bookmarkStart w:id="9" w:name="_x8b6f4wxpp85"/>
+      <w:bookmarkStart w:name="_x8b6f4wxpp85" w:id="9"/>
       <w:bookmarkEnd w:id="9"/>
       <w:r>
         <w:rPr/>
         <w:t>2.2. Situação Atual e Motivação</w:t>
       </w:r>
     </w:p>
-    <w:p>
+    <w:p xmlns:wp14="http://schemas.microsoft.com/office/word/2010/wordml" wp14:textId="77777777">
       <w:pPr>
         <w:pStyle w:val="normal1"/>
         <w:rPr/>
@@ -449,12 +486,12 @@
         <w:t>Na estrutura operacional vigente, o agendamento de transportes sociais e acompanhamentos é efetuado através de métodos convencionais, manuais e descentralizados — assentando maioritariamente em chamadas telefónicas, folhas de cálculo dispersas e anotações físicas.</w:t>
       </w:r>
     </w:p>
-    <w:p>
+    <w:p xmlns:wp14="http://schemas.microsoft.com/office/word/2010/wordml" wp14:textId="77777777">
       <w:pPr>
         <w:pStyle w:val="Heading3"/>
         <w:rPr/>
       </w:pPr>
-      <w:bookmarkStart w:id="10" w:name="_k3f9hvt6e704"/>
+      <w:bookmarkStart w:name="_k3f9hvt6e704" w:id="10"/>
       <w:bookmarkEnd w:id="10"/>
       <w:r>
         <w:rPr/>
@@ -492,7 +529,7 @@
         <w:gridCol w:w="3500"/>
         <w:gridCol w:w="3500"/>
       </w:tblGrid>
-      <w:tr>
+      <w:tr xmlns:wp14="http://schemas.microsoft.com/office/word/2010/wordml" wp14:textId="77777777">
         <w:trPr>
           <w:tblHeader w:val="true"/>
         </w:trPr>
@@ -500,11 +537,11 @@
           <w:tcPr>
             <w:tcW w:w="3500" w:type="dxa"/>
             <w:tcBorders>
-              <w:top w:val="single" w:sz="8" w:space="0" w:color="E2E8F0"/>
-              <w:bottom w:val="single" w:sz="8" w:space="0" w:color="F1F5F9"/>
-            </w:tcBorders>
-          </w:tcPr>
-          <w:p>
+              <w:top w:val="single" w:color="E2E8F0" w:sz="8" w:space="0"/>
+              <w:bottom w:val="single" w:color="F1F5F9" w:sz="8" w:space="0"/>
+            </w:tcBorders>
+          </w:tcPr>
+          <w:p wp14:textId="77777777">
             <w:pPr>
               <w:pStyle w:val="normal1"/>
               <w:rPr/>
@@ -519,11 +556,11 @@
           <w:tcPr>
             <w:tcW w:w="3500" w:type="dxa"/>
             <w:tcBorders>
-              <w:top w:val="single" w:sz="8" w:space="0" w:color="E2E8F0"/>
-              <w:bottom w:val="single" w:sz="8" w:space="0" w:color="F1F5F9"/>
-            </w:tcBorders>
-          </w:tcPr>
-          <w:p>
+              <w:top w:val="single" w:color="E2E8F0" w:sz="8" w:space="0"/>
+              <w:bottom w:val="single" w:color="F1F5F9" w:sz="8" w:space="0"/>
+            </w:tcBorders>
+          </w:tcPr>
+          <w:p wp14:textId="77777777">
             <w:pPr>
               <w:pStyle w:val="normal1"/>
               <w:rPr/>
@@ -538,11 +575,11 @@
           <w:tcPr>
             <w:tcW w:w="3500" w:type="dxa"/>
             <w:tcBorders>
-              <w:top w:val="single" w:sz="8" w:space="0" w:color="E2E8F0"/>
-              <w:bottom w:val="single" w:sz="8" w:space="0" w:color="F1F5F9"/>
-            </w:tcBorders>
-          </w:tcPr>
-          <w:p>
+              <w:top w:val="single" w:color="E2E8F0" w:sz="8" w:space="0"/>
+              <w:bottom w:val="single" w:color="F1F5F9" w:sz="8" w:space="0"/>
+            </w:tcBorders>
+          </w:tcPr>
+          <w:p wp14:textId="77777777">
             <w:pPr>
               <w:pStyle w:val="normal1"/>
               <w:rPr/>
@@ -554,17 +591,17 @@
           </w:p>
         </w:tc>
       </w:tr>
-      <w:tr>
+      <w:tr xmlns:wp14="http://schemas.microsoft.com/office/word/2010/wordml" wp14:textId="77777777">
         <w:trPr/>
         <w:tc>
           <w:tcPr>
             <w:tcW w:w="3500" w:type="dxa"/>
             <w:tcBorders>
-              <w:top w:val="single" w:sz="8" w:space="0" w:color="F1F5F9"/>
-              <w:bottom w:val="single" w:sz="8" w:space="0" w:color="F1F5F9"/>
-            </w:tcBorders>
-          </w:tcPr>
-          <w:p>
+              <w:top w:val="single" w:color="F1F5F9" w:sz="8" w:space="0"/>
+              <w:bottom w:val="single" w:color="F1F5F9" w:sz="8" w:space="0"/>
+            </w:tcBorders>
+          </w:tcPr>
+          <w:p wp14:textId="77777777">
             <w:pPr>
               <w:pStyle w:val="normal1"/>
               <w:rPr/>
@@ -582,11 +619,11 @@
           <w:tcPr>
             <w:tcW w:w="3500" w:type="dxa"/>
             <w:tcBorders>
-              <w:top w:val="single" w:sz="8" w:space="0" w:color="F1F5F9"/>
-              <w:bottom w:val="single" w:sz="8" w:space="0" w:color="F1F5F9"/>
-            </w:tcBorders>
-          </w:tcPr>
-          <w:p>
+              <w:top w:val="single" w:color="F1F5F9" w:sz="8" w:space="0"/>
+              <w:bottom w:val="single" w:color="F1F5F9" w:sz="8" w:space="0"/>
+            </w:tcBorders>
+          </w:tcPr>
+          <w:p wp14:textId="77777777">
             <w:pPr>
               <w:pStyle w:val="normal1"/>
               <w:rPr/>
@@ -601,11 +638,11 @@
           <w:tcPr>
             <w:tcW w:w="3500" w:type="dxa"/>
             <w:tcBorders>
-              <w:top w:val="single" w:sz="8" w:space="0" w:color="F1F5F9"/>
-              <w:bottom w:val="single" w:sz="8" w:space="0" w:color="F1F5F9"/>
-            </w:tcBorders>
-          </w:tcPr>
-          <w:p>
+              <w:top w:val="single" w:color="F1F5F9" w:sz="8" w:space="0"/>
+              <w:bottom w:val="single" w:color="F1F5F9" w:sz="8" w:space="0"/>
+            </w:tcBorders>
+          </w:tcPr>
+          <w:p wp14:textId="77777777">
             <w:pPr>
               <w:pStyle w:val="normal1"/>
               <w:rPr/>
@@ -617,17 +654,17 @@
           </w:p>
         </w:tc>
       </w:tr>
-      <w:tr>
+      <w:tr xmlns:wp14="http://schemas.microsoft.com/office/word/2010/wordml" wp14:textId="77777777">
         <w:trPr/>
         <w:tc>
           <w:tcPr>
             <w:tcW w:w="3500" w:type="dxa"/>
             <w:tcBorders>
-              <w:top w:val="single" w:sz="8" w:space="0" w:color="F1F5F9"/>
-              <w:bottom w:val="single" w:sz="8" w:space="0" w:color="F1F5F9"/>
-            </w:tcBorders>
-          </w:tcPr>
-          <w:p>
+              <w:top w:val="single" w:color="F1F5F9" w:sz="8" w:space="0"/>
+              <w:bottom w:val="single" w:color="F1F5F9" w:sz="8" w:space="0"/>
+            </w:tcBorders>
+          </w:tcPr>
+          <w:p wp14:textId="77777777">
             <w:pPr>
               <w:pStyle w:val="normal1"/>
               <w:rPr/>
@@ -645,11 +682,11 @@
           <w:tcPr>
             <w:tcW w:w="3500" w:type="dxa"/>
             <w:tcBorders>
-              <w:top w:val="single" w:sz="8" w:space="0" w:color="F1F5F9"/>
-              <w:bottom w:val="single" w:sz="8" w:space="0" w:color="F1F5F9"/>
-            </w:tcBorders>
-          </w:tcPr>
-          <w:p>
+              <w:top w:val="single" w:color="F1F5F9" w:sz="8" w:space="0"/>
+              <w:bottom w:val="single" w:color="F1F5F9" w:sz="8" w:space="0"/>
+            </w:tcBorders>
+          </w:tcPr>
+          <w:p wp14:textId="77777777">
             <w:pPr>
               <w:pStyle w:val="normal1"/>
               <w:rPr/>
@@ -664,11 +701,11 @@
           <w:tcPr>
             <w:tcW w:w="3500" w:type="dxa"/>
             <w:tcBorders>
-              <w:top w:val="single" w:sz="8" w:space="0" w:color="F1F5F9"/>
-              <w:bottom w:val="single" w:sz="8" w:space="0" w:color="F1F5F9"/>
-            </w:tcBorders>
-          </w:tcPr>
-          <w:p>
+              <w:top w:val="single" w:color="F1F5F9" w:sz="8" w:space="0"/>
+              <w:bottom w:val="single" w:color="F1F5F9" w:sz="8" w:space="0"/>
+            </w:tcBorders>
+          </w:tcPr>
+          <w:p wp14:textId="77777777">
             <w:pPr>
               <w:pStyle w:val="normal1"/>
               <w:rPr/>
@@ -680,17 +717,17 @@
           </w:p>
         </w:tc>
       </w:tr>
-      <w:tr>
+      <w:tr xmlns:wp14="http://schemas.microsoft.com/office/word/2010/wordml" wp14:textId="77777777">
         <w:trPr/>
         <w:tc>
           <w:tcPr>
             <w:tcW w:w="3500" w:type="dxa"/>
             <w:tcBorders>
-              <w:top w:val="single" w:sz="8" w:space="0" w:color="F1F5F9"/>
-              <w:bottom w:val="single" w:sz="8" w:space="0" w:color="F1F5F9"/>
-            </w:tcBorders>
-          </w:tcPr>
-          <w:p>
+              <w:top w:val="single" w:color="F1F5F9" w:sz="8" w:space="0"/>
+              <w:bottom w:val="single" w:color="F1F5F9" w:sz="8" w:space="0"/>
+            </w:tcBorders>
+          </w:tcPr>
+          <w:p wp14:textId="77777777">
             <w:pPr>
               <w:pStyle w:val="normal1"/>
               <w:rPr/>
@@ -708,11 +745,11 @@
           <w:tcPr>
             <w:tcW w:w="3500" w:type="dxa"/>
             <w:tcBorders>
-              <w:top w:val="single" w:sz="8" w:space="0" w:color="F1F5F9"/>
-              <w:bottom w:val="single" w:sz="8" w:space="0" w:color="F1F5F9"/>
-            </w:tcBorders>
-          </w:tcPr>
-          <w:p>
+              <w:top w:val="single" w:color="F1F5F9" w:sz="8" w:space="0"/>
+              <w:bottom w:val="single" w:color="F1F5F9" w:sz="8" w:space="0"/>
+            </w:tcBorders>
+          </w:tcPr>
+          <w:p wp14:textId="77777777">
             <w:pPr>
               <w:pStyle w:val="normal1"/>
               <w:rPr/>
@@ -727,11 +764,11 @@
           <w:tcPr>
             <w:tcW w:w="3500" w:type="dxa"/>
             <w:tcBorders>
-              <w:top w:val="single" w:sz="8" w:space="0" w:color="F1F5F9"/>
-              <w:bottom w:val="single" w:sz="8" w:space="0" w:color="F1F5F9"/>
-            </w:tcBorders>
-          </w:tcPr>
-          <w:p>
+              <w:top w:val="single" w:color="F1F5F9" w:sz="8" w:space="0"/>
+              <w:bottom w:val="single" w:color="F1F5F9" w:sz="8" w:space="0"/>
+            </w:tcBorders>
+          </w:tcPr>
+          <w:p wp14:textId="77777777">
             <w:pPr>
               <w:pStyle w:val="normal1"/>
               <w:rPr/>
@@ -743,17 +780,17 @@
           </w:p>
         </w:tc>
       </w:tr>
-      <w:tr>
+      <w:tr xmlns:wp14="http://schemas.microsoft.com/office/word/2010/wordml" wp14:textId="77777777">
         <w:trPr/>
         <w:tc>
           <w:tcPr>
             <w:tcW w:w="3500" w:type="dxa"/>
             <w:tcBorders>
-              <w:top w:val="single" w:sz="8" w:space="0" w:color="F1F5F9"/>
-              <w:bottom w:val="single" w:sz="8" w:space="0" w:color="E2E8F0"/>
-            </w:tcBorders>
-          </w:tcPr>
-          <w:p>
+              <w:top w:val="single" w:color="F1F5F9" w:sz="8" w:space="0"/>
+              <w:bottom w:val="single" w:color="E2E8F0" w:sz="8" w:space="0"/>
+            </w:tcBorders>
+          </w:tcPr>
+          <w:p wp14:textId="77777777">
             <w:pPr>
               <w:pStyle w:val="normal1"/>
               <w:rPr/>
@@ -771,11 +808,11 @@
           <w:tcPr>
             <w:tcW w:w="3500" w:type="dxa"/>
             <w:tcBorders>
-              <w:top w:val="single" w:sz="8" w:space="0" w:color="F1F5F9"/>
-              <w:bottom w:val="single" w:sz="8" w:space="0" w:color="E2E8F0"/>
-            </w:tcBorders>
-          </w:tcPr>
-          <w:p>
+              <w:top w:val="single" w:color="F1F5F9" w:sz="8" w:space="0"/>
+              <w:bottom w:val="single" w:color="E2E8F0" w:sz="8" w:space="0"/>
+            </w:tcBorders>
+          </w:tcPr>
+          <w:p wp14:textId="77777777">
             <w:pPr>
               <w:pStyle w:val="normal1"/>
               <w:rPr/>
@@ -790,11 +827,11 @@
           <w:tcPr>
             <w:tcW w:w="3500" w:type="dxa"/>
             <w:tcBorders>
-              <w:top w:val="single" w:sz="8" w:space="0" w:color="F1F5F9"/>
-              <w:bottom w:val="single" w:sz="8" w:space="0" w:color="E2E8F0"/>
-            </w:tcBorders>
-          </w:tcPr>
-          <w:p>
+              <w:top w:val="single" w:color="F1F5F9" w:sz="8" w:space="0"/>
+              <w:bottom w:val="single" w:color="E2E8F0" w:sz="8" w:space="0"/>
+            </w:tcBorders>
+          </w:tcPr>
+          <w:p wp14:textId="77777777">
             <w:pPr>
               <w:pStyle w:val="normal1"/>
               <w:rPr/>
@@ -818,31 +855,31 @@
         </w:tc>
       </w:tr>
     </w:tbl>
-    <w:p>
+    <w:p xmlns:wp14="http://schemas.microsoft.com/office/word/2010/wordml" wp14:textId="77777777">
       <w:pPr>
         <w:pStyle w:val="Heading1"/>
         <w:rPr/>
       </w:pPr>
-      <w:bookmarkStart w:id="11" w:name="_d3ue1cfpe68m"/>
+      <w:bookmarkStart w:name="_d3ue1cfpe68m" w:id="11"/>
       <w:bookmarkEnd w:id="11"/>
       <w:r>
         <w:rPr/>
         <w:t>3. Posicionamento e Proposta de Valor</w:t>
       </w:r>
     </w:p>
-    <w:p>
+    <w:p xmlns:wp14="http://schemas.microsoft.com/office/word/2010/wordml" wp14:textId="77777777">
       <w:pPr>
         <w:pStyle w:val="Heading2"/>
         <w:rPr/>
       </w:pPr>
-      <w:bookmarkStart w:id="12" w:name="_pgclbrd3s2gz"/>
+      <w:bookmarkStart w:name="_pgclbrd3s2gz" w:id="12"/>
       <w:bookmarkEnd w:id="12"/>
       <w:r>
         <w:rPr/>
         <w:t>3.1. Transformação Digital e Modelo de Valor</w:t>
       </w:r>
     </w:p>
-    <w:p>
+    <w:p xmlns:wp14="http://schemas.microsoft.com/office/word/2010/wordml" wp14:textId="77777777">
       <w:pPr>
         <w:pStyle w:val="normal1"/>
         <w:rPr/>
@@ -863,7 +900,7 @@
         <w:t xml:space="preserve"> reconfigura a gestão de mobilidade assistida ao introduzir um ecossistema digital assente em três pilares operacionais:</w:t>
       </w:r>
     </w:p>
-    <w:p>
+    <w:p xmlns:wp14="http://schemas.microsoft.com/office/word/2010/wordml" wp14:textId="77777777">
       <w:pPr>
         <w:pStyle w:val="normal1"/>
         <w:keepNext w:val="false"/>
@@ -872,8 +909,8 @@
         <w:widowControl w:val="false"/>
         <w:pBdr/>
         <w:shd w:val="clear" w:fill="auto"/>
-        <w:spacing w:lineRule="auto" w:line="276" w:before="0" w:after="0"/>
-        <w:ind w:hanging="0" w:left="0" w:right="0"/>
+        <w:spacing w:before="0" w:after="0" w:line="276" w:lineRule="auto"/>
+        <w:ind w:left="0" w:right="0" w:hanging="0"/>
         <w:jc w:val="left"/>
         <w:rPr/>
       </w:pPr>
@@ -881,14 +918,14 @@
         <w:rPr/>
       </w:r>
     </w:p>
-    <w:p>
+    <w:p xmlns:wp14="http://schemas.microsoft.com/office/word/2010/wordml" wp14:textId="77777777">
       <w:pPr>
         <w:pStyle w:val="normal1"/>
         <w:numPr>
           <w:ilvl w:val="0"/>
           <w:numId w:val="2"/>
         </w:numPr>
-        <w:ind w:hanging="360" w:left="720"/>
+        <w:ind w:left="720" w:hanging="360"/>
         <w:rPr/>
       </w:pPr>
       <w:r>
@@ -903,14 +940,14 @@
         <w:t xml:space="preserve"> Algoritmo dinâmico que cruza em tempo real o perfil de mobilidade e suporte médico do utente (necessidade de rampa/elevador, transporte de oxigénio, acompanhamento pedestre ativo) com as especificações da viatura e competências do condutor.</w:t>
       </w:r>
     </w:p>
-    <w:p>
+    <w:p xmlns:wp14="http://schemas.microsoft.com/office/word/2010/wordml" wp14:textId="77777777">
       <w:pPr>
         <w:pStyle w:val="normal1"/>
         <w:numPr>
           <w:ilvl w:val="0"/>
           <w:numId w:val="2"/>
         </w:numPr>
-        <w:ind w:hanging="360" w:left="720"/>
+        <w:ind w:left="720" w:hanging="360"/>
         <w:rPr/>
       </w:pPr>
       <w:r>
@@ -936,14 +973,14 @@
         <w:t xml:space="preserve"> / botões virtuais de "Fim de Consulta") nas unidades de saúde, permitindo que o serviço de regresso seja acionado apenas quando a consulta finalizar.</w:t>
       </w:r>
     </w:p>
-    <w:p>
+    <w:p xmlns:wp14="http://schemas.microsoft.com/office/word/2010/wordml" wp14:textId="77777777">
       <w:pPr>
         <w:pStyle w:val="normal1"/>
         <w:numPr>
           <w:ilvl w:val="0"/>
           <w:numId w:val="2"/>
         </w:numPr>
-        <w:ind w:hanging="360" w:left="720"/>
+        <w:ind w:left="720" w:hanging="360"/>
         <w:rPr/>
       </w:pPr>
       <w:r>
@@ -958,26 +995,26 @@
         <w:t xml:space="preserve"> Mecanismo transparente de registo e atribuição de créditos de tempo aos voluntários, convertíveis em benefícios na rede comunitária e parceiros locais.</w:t>
       </w:r>
     </w:p>
-    <w:p>
+    <w:p xmlns:wp14="http://schemas.microsoft.com/office/word/2010/wordml" wp14:textId="77777777">
       <w:pPr>
         <w:pStyle w:val="Heading2"/>
         <w:rPr/>
       </w:pPr>
-      <w:bookmarkStart w:id="13" w:name="_ozk7vcratma0"/>
+      <w:bookmarkStart w:name="_ozk7vcratma0" w:id="13"/>
       <w:bookmarkEnd w:id="13"/>
       <w:r>
         <w:rPr/>
         <w:t>3.2. Declaração de Posicionamento do Produto</w:t>
       </w:r>
     </w:p>
-    <w:p>
+    <w:p xmlns:wp14="http://schemas.microsoft.com/office/word/2010/wordml" wp14:textId="77777777">
       <w:pPr>
         <w:pStyle w:val="normal1"/>
         <w:numPr>
           <w:ilvl w:val="0"/>
           <w:numId w:val="2"/>
         </w:numPr>
-        <w:ind w:hanging="360" w:left="720"/>
+        <w:ind w:left="720" w:hanging="360"/>
         <w:rPr/>
       </w:pPr>
       <w:r>
@@ -992,14 +1029,14 @@
         <w:t xml:space="preserve"> Pessoas idosas ou com mobilidade reduzida e instituições sociais (IPSS/Lares/ERPIs);</w:t>
       </w:r>
     </w:p>
-    <w:p>
+    <w:p xmlns:wp14="http://schemas.microsoft.com/office/word/2010/wordml" wp14:textId="77777777">
       <w:pPr>
         <w:pStyle w:val="normal1"/>
         <w:numPr>
           <w:ilvl w:val="0"/>
           <w:numId w:val="2"/>
         </w:numPr>
-        <w:ind w:hanging="360" w:left="720"/>
+        <w:ind w:left="720" w:hanging="360"/>
         <w:rPr/>
       </w:pPr>
       <w:r>
@@ -1014,14 +1051,14 @@
         <w:t xml:space="preserve"> Necessitam de transporte e acompanhamento assistido porta-a-porta para consultas médicas não urgentes, exames e tratamentos;</w:t>
       </w:r>
     </w:p>
-    <w:p>
+    <w:p xmlns:wp14="http://schemas.microsoft.com/office/word/2010/wordml" wp14:textId="77777777">
       <w:pPr>
         <w:pStyle w:val="normal1"/>
         <w:numPr>
           <w:ilvl w:val="0"/>
           <w:numId w:val="2"/>
         </w:numPr>
-        <w:ind w:hanging="360" w:left="720"/>
+        <w:ind w:left="720" w:hanging="360"/>
         <w:rPr/>
       </w:pPr>
       <w:r>
@@ -1036,14 +1073,14 @@
         <w:t xml:space="preserve"> É uma Plataforma Digital de Gestão Integrada de Mobilidade Assistida (composta por Aplicação Móvel, Portal Web de Gestão e Canais Assistidos);</w:t>
       </w:r>
     </w:p>
-    <w:p>
+    <w:p xmlns:wp14="http://schemas.microsoft.com/office/word/2010/wordml" wp14:textId="77777777">
       <w:pPr>
         <w:pStyle w:val="normal1"/>
         <w:numPr>
           <w:ilvl w:val="0"/>
           <w:numId w:val="2"/>
         </w:numPr>
-        <w:ind w:hanging="360" w:left="720"/>
+        <w:ind w:left="720" w:hanging="360"/>
         <w:rPr/>
       </w:pPr>
       <w:r>
@@ -1069,14 +1106,14 @@
         <w:t xml:space="preserve"> entre necessidades de mobilidade, condutores voluntários e frotas adaptadas parceiras, integrando alertas de término de consulta em tempo real;</w:t>
       </w:r>
     </w:p>
-    <w:p>
+    <w:p xmlns:wp14="http://schemas.microsoft.com/office/word/2010/wordml" wp14:textId="77777777">
       <w:pPr>
         <w:pStyle w:val="normal1"/>
         <w:numPr>
           <w:ilvl w:val="0"/>
           <w:numId w:val="2"/>
         </w:numPr>
-        <w:ind w:hanging="360" w:left="720"/>
+        <w:ind w:left="720" w:hanging="360"/>
         <w:rPr/>
       </w:pPr>
       <w:r>
@@ -1091,14 +1128,14 @@
         <w:t xml:space="preserve"> Serviços de transporte privado tradicionais, frota de táxis convencionais sem apoio personalizado ou agendamentos manuais desarticulados;</w:t>
       </w:r>
     </w:p>
-    <w:p>
+    <w:p xmlns:wp14="http://schemas.microsoft.com/office/word/2010/wordml" wp14:textId="77777777">
       <w:pPr>
         <w:pStyle w:val="normal1"/>
         <w:numPr>
           <w:ilvl w:val="0"/>
           <w:numId w:val="2"/>
         </w:numPr>
-        <w:ind w:hanging="360" w:left="720"/>
+        <w:ind w:left="720" w:hanging="360"/>
         <w:rPr/>
       </w:pPr>
       <w:r>
@@ -1113,12 +1150,12 @@
         <w:t xml:space="preserve"> Assegura continuidade de acompanhamento humano, otimização híbrida de frotas sociais e eliminação de tempos de espera hospitalares via tecnologia IoT.</w:t>
       </w:r>
     </w:p>
-    <w:p>
+    <w:p xmlns:wp14="http://schemas.microsoft.com/office/word/2010/wordml" wp14:textId="77777777">
       <w:pPr>
         <w:pStyle w:val="Heading2"/>
         <w:rPr/>
       </w:pPr>
-      <w:bookmarkStart w:id="14" w:name="_fn3yvf7pu1h"/>
+      <w:bookmarkStart w:name="_fn3yvf7pu1h" w:id="14"/>
       <w:bookmarkEnd w:id="14"/>
       <w:r>
         <w:rPr/>
@@ -1146,7 +1183,7 @@
         <w:gridCol w:w="3500"/>
         <w:gridCol w:w="3499"/>
       </w:tblGrid>
-      <w:tr>
+      <w:tr xmlns:wp14="http://schemas.microsoft.com/office/word/2010/wordml" wp14:textId="77777777">
         <w:trPr>
           <w:tblHeader w:val="true"/>
         </w:trPr>
@@ -1154,11 +1191,11 @@
           <w:tcPr>
             <w:tcW w:w="3500" w:type="dxa"/>
             <w:tcBorders>
-              <w:top w:val="single" w:sz="8" w:space="0" w:color="E2E8F0"/>
-              <w:bottom w:val="single" w:sz="8" w:space="0" w:color="F1F5F9"/>
-            </w:tcBorders>
-          </w:tcPr>
-          <w:p>
+              <w:top w:val="single" w:color="E2E8F0" w:sz="8" w:space="0"/>
+              <w:bottom w:val="single" w:color="F1F5F9" w:sz="8" w:space="0"/>
+            </w:tcBorders>
+          </w:tcPr>
+          <w:p wp14:textId="77777777">
             <w:pPr>
               <w:pStyle w:val="normal1"/>
               <w:rPr/>
@@ -1173,11 +1210,11 @@
           <w:tcPr>
             <w:tcW w:w="3500" w:type="dxa"/>
             <w:tcBorders>
-              <w:top w:val="single" w:sz="8" w:space="0" w:color="E2E8F0"/>
-              <w:bottom w:val="single" w:sz="8" w:space="0" w:color="F1F5F9"/>
-            </w:tcBorders>
-          </w:tcPr>
-          <w:p>
+              <w:top w:val="single" w:color="E2E8F0" w:sz="8" w:space="0"/>
+              <w:bottom w:val="single" w:color="F1F5F9" w:sz="8" w:space="0"/>
+            </w:tcBorders>
+          </w:tcPr>
+          <w:p wp14:textId="77777777">
             <w:pPr>
               <w:pStyle w:val="normal1"/>
               <w:rPr/>
@@ -1192,11 +1229,11 @@
           <w:tcPr>
             <w:tcW w:w="3500" w:type="dxa"/>
             <w:tcBorders>
-              <w:top w:val="single" w:sz="8" w:space="0" w:color="E2E8F0"/>
-              <w:bottom w:val="single" w:sz="8" w:space="0" w:color="F1F5F9"/>
-            </w:tcBorders>
-          </w:tcPr>
-          <w:p>
+              <w:top w:val="single" w:color="E2E8F0" w:sz="8" w:space="0"/>
+              <w:bottom w:val="single" w:color="F1F5F9" w:sz="8" w:space="0"/>
+            </w:tcBorders>
+          </w:tcPr>
+          <w:p wp14:textId="77777777">
             <w:pPr>
               <w:pStyle w:val="normal1"/>
               <w:rPr/>
@@ -1211,11 +1248,11 @@
           <w:tcPr>
             <w:tcW w:w="3499" w:type="dxa"/>
             <w:tcBorders>
-              <w:top w:val="single" w:sz="8" w:space="0" w:color="E2E8F0"/>
-              <w:bottom w:val="single" w:sz="8" w:space="0" w:color="F1F5F9"/>
-            </w:tcBorders>
-          </w:tcPr>
-          <w:p>
+              <w:top w:val="single" w:color="E2E8F0" w:sz="8" w:space="0"/>
+              <w:bottom w:val="single" w:color="F1F5F9" w:sz="8" w:space="0"/>
+            </w:tcBorders>
+          </w:tcPr>
+          <w:p wp14:textId="77777777">
             <w:pPr>
               <w:pStyle w:val="normal1"/>
               <w:rPr/>
@@ -1227,17 +1264,17 @@
           </w:p>
         </w:tc>
       </w:tr>
-      <w:tr>
+      <w:tr xmlns:wp14="http://schemas.microsoft.com/office/word/2010/wordml" wp14:textId="77777777">
         <w:trPr/>
         <w:tc>
           <w:tcPr>
             <w:tcW w:w="3500" w:type="dxa"/>
             <w:tcBorders>
-              <w:top w:val="single" w:sz="8" w:space="0" w:color="F1F5F9"/>
-              <w:bottom w:val="single" w:sz="8" w:space="0" w:color="F1F5F9"/>
-            </w:tcBorders>
-          </w:tcPr>
-          <w:p>
+              <w:top w:val="single" w:color="F1F5F9" w:sz="8" w:space="0"/>
+              <w:bottom w:val="single" w:color="F1F5F9" w:sz="8" w:space="0"/>
+            </w:tcBorders>
+          </w:tcPr>
+          <w:p wp14:textId="77777777">
             <w:pPr>
               <w:pStyle w:val="normal1"/>
               <w:rPr/>
@@ -1255,11 +1292,11 @@
           <w:tcPr>
             <w:tcW w:w="3500" w:type="dxa"/>
             <w:tcBorders>
-              <w:top w:val="single" w:sz="8" w:space="0" w:color="F1F5F9"/>
-              <w:bottom w:val="single" w:sz="8" w:space="0" w:color="F1F5F9"/>
-            </w:tcBorders>
-          </w:tcPr>
-          <w:p>
+              <w:top w:val="single" w:color="F1F5F9" w:sz="8" w:space="0"/>
+              <w:bottom w:val="single" w:color="F1F5F9" w:sz="8" w:space="0"/>
+            </w:tcBorders>
+          </w:tcPr>
+          <w:p wp14:textId="77777777">
             <w:pPr>
               <w:pStyle w:val="normal1"/>
               <w:rPr/>
@@ -1274,11 +1311,11 @@
           <w:tcPr>
             <w:tcW w:w="3500" w:type="dxa"/>
             <w:tcBorders>
-              <w:top w:val="single" w:sz="8" w:space="0" w:color="F1F5F9"/>
-              <w:bottom w:val="single" w:sz="8" w:space="0" w:color="F1F5F9"/>
-            </w:tcBorders>
-          </w:tcPr>
-          <w:p>
+              <w:top w:val="single" w:color="F1F5F9" w:sz="8" w:space="0"/>
+              <w:bottom w:val="single" w:color="F1F5F9" w:sz="8" w:space="0"/>
+            </w:tcBorders>
+          </w:tcPr>
+          <w:p wp14:textId="77777777">
             <w:pPr>
               <w:pStyle w:val="normal1"/>
               <w:rPr/>
@@ -1293,11 +1330,11 @@
           <w:tcPr>
             <w:tcW w:w="3499" w:type="dxa"/>
             <w:tcBorders>
-              <w:top w:val="single" w:sz="8" w:space="0" w:color="F1F5F9"/>
-              <w:bottom w:val="single" w:sz="8" w:space="0" w:color="F1F5F9"/>
-            </w:tcBorders>
-          </w:tcPr>
-          <w:p>
+              <w:top w:val="single" w:color="F1F5F9" w:sz="8" w:space="0"/>
+              <w:bottom w:val="single" w:color="F1F5F9" w:sz="8" w:space="0"/>
+            </w:tcBorders>
+          </w:tcPr>
+          <w:p wp14:textId="77777777">
             <w:pPr>
               <w:pStyle w:val="normal1"/>
               <w:rPr/>
@@ -1314,12 +1351,12 @@
               <w:sdtContent>
                 <w:r>
                   <w:rPr>
-                    <w:shd w:fill="auto" w:val="clear"/>
+                    <w:shd w:val="clear" w:fill="auto"/>
                   </w:rPr>
                 </w:r>
                 <w:r>
                   <w:rPr>
-                    <w:shd w:fill="auto" w:val="clear"/>
+                    <w:shd w:val="clear" w:fill="auto"/>
                   </w:rPr>
                   <w:t>Alto</w:t>
                 </w:r>
@@ -1328,17 +1365,17 @@
           </w:p>
         </w:tc>
       </w:tr>
-      <w:tr>
+      <w:tr xmlns:wp14="http://schemas.microsoft.com/office/word/2010/wordml" wp14:textId="77777777">
         <w:trPr/>
         <w:tc>
           <w:tcPr>
             <w:tcW w:w="3500" w:type="dxa"/>
             <w:tcBorders>
-              <w:top w:val="single" w:sz="8" w:space="0" w:color="F1F5F9"/>
-              <w:bottom w:val="single" w:sz="8" w:space="0" w:color="F1F5F9"/>
-            </w:tcBorders>
-          </w:tcPr>
-          <w:p>
+              <w:top w:val="single" w:color="F1F5F9" w:sz="8" w:space="0"/>
+              <w:bottom w:val="single" w:color="F1F5F9" w:sz="8" w:space="0"/>
+            </w:tcBorders>
+          </w:tcPr>
+          <w:p wp14:textId="77777777">
             <w:pPr>
               <w:pStyle w:val="normal1"/>
               <w:rPr/>
@@ -1356,11 +1393,11 @@
           <w:tcPr>
             <w:tcW w:w="3500" w:type="dxa"/>
             <w:tcBorders>
-              <w:top w:val="single" w:sz="8" w:space="0" w:color="F1F5F9"/>
-              <w:bottom w:val="single" w:sz="8" w:space="0" w:color="F1F5F9"/>
-            </w:tcBorders>
-          </w:tcPr>
-          <w:p>
+              <w:top w:val="single" w:color="F1F5F9" w:sz="8" w:space="0"/>
+              <w:bottom w:val="single" w:color="F1F5F9" w:sz="8" w:space="0"/>
+            </w:tcBorders>
+          </w:tcPr>
+          <w:p wp14:textId="77777777">
             <w:pPr>
               <w:pStyle w:val="normal1"/>
               <w:rPr/>
@@ -1375,11 +1412,11 @@
           <w:tcPr>
             <w:tcW w:w="3500" w:type="dxa"/>
             <w:tcBorders>
-              <w:top w:val="single" w:sz="8" w:space="0" w:color="F1F5F9"/>
-              <w:bottom w:val="single" w:sz="8" w:space="0" w:color="F1F5F9"/>
-            </w:tcBorders>
-          </w:tcPr>
-          <w:p>
+              <w:top w:val="single" w:color="F1F5F9" w:sz="8" w:space="0"/>
+              <w:bottom w:val="single" w:color="F1F5F9" w:sz="8" w:space="0"/>
+            </w:tcBorders>
+          </w:tcPr>
+          <w:p wp14:textId="77777777">
             <w:pPr>
               <w:pStyle w:val="normal1"/>
               <w:rPr/>
@@ -1394,11 +1431,11 @@
           <w:tcPr>
             <w:tcW w:w="3499" w:type="dxa"/>
             <w:tcBorders>
-              <w:top w:val="single" w:sz="8" w:space="0" w:color="F1F5F9"/>
-              <w:bottom w:val="single" w:sz="8" w:space="0" w:color="F1F5F9"/>
-            </w:tcBorders>
-          </w:tcPr>
-          <w:p>
+              <w:top w:val="single" w:color="F1F5F9" w:sz="8" w:space="0"/>
+              <w:bottom w:val="single" w:color="F1F5F9" w:sz="8" w:space="0"/>
+            </w:tcBorders>
+          </w:tcPr>
+          <w:p wp14:textId="77777777">
             <w:pPr>
               <w:pStyle w:val="normal1"/>
               <w:rPr/>
@@ -1415,12 +1452,12 @@
               <w:sdtContent>
                 <w:r>
                   <w:rPr>
-                    <w:shd w:fill="auto" w:val="clear"/>
+                    <w:shd w:val="clear" w:fill="auto"/>
                   </w:rPr>
                 </w:r>
                 <w:r>
                   <w:rPr>
-                    <w:shd w:fill="auto" w:val="clear"/>
+                    <w:shd w:val="clear" w:fill="auto"/>
                   </w:rPr>
                   <w:t>Alto</w:t>
                 </w:r>
@@ -1429,17 +1466,17 @@
           </w:p>
         </w:tc>
       </w:tr>
-      <w:tr>
+      <w:tr xmlns:wp14="http://schemas.microsoft.com/office/word/2010/wordml" wp14:textId="77777777">
         <w:trPr/>
         <w:tc>
           <w:tcPr>
             <w:tcW w:w="3500" w:type="dxa"/>
             <w:tcBorders>
-              <w:top w:val="single" w:sz="8" w:space="0" w:color="F1F5F9"/>
-              <w:bottom w:val="single" w:sz="8" w:space="0" w:color="F1F5F9"/>
-            </w:tcBorders>
-          </w:tcPr>
-          <w:p>
+              <w:top w:val="single" w:color="F1F5F9" w:sz="8" w:space="0"/>
+              <w:bottom w:val="single" w:color="F1F5F9" w:sz="8" w:space="0"/>
+            </w:tcBorders>
+          </w:tcPr>
+          <w:p wp14:textId="77777777">
             <w:pPr>
               <w:pStyle w:val="normal1"/>
               <w:rPr/>
@@ -1457,11 +1494,11 @@
           <w:tcPr>
             <w:tcW w:w="3500" w:type="dxa"/>
             <w:tcBorders>
-              <w:top w:val="single" w:sz="8" w:space="0" w:color="F1F5F9"/>
-              <w:bottom w:val="single" w:sz="8" w:space="0" w:color="F1F5F9"/>
-            </w:tcBorders>
-          </w:tcPr>
-          <w:p>
+              <w:top w:val="single" w:color="F1F5F9" w:sz="8" w:space="0"/>
+              <w:bottom w:val="single" w:color="F1F5F9" w:sz="8" w:space="0"/>
+            </w:tcBorders>
+          </w:tcPr>
+          <w:p wp14:textId="77777777">
             <w:pPr>
               <w:pStyle w:val="normal1"/>
               <w:rPr/>
@@ -1476,11 +1513,11 @@
           <w:tcPr>
             <w:tcW w:w="3500" w:type="dxa"/>
             <w:tcBorders>
-              <w:top w:val="single" w:sz="8" w:space="0" w:color="F1F5F9"/>
-              <w:bottom w:val="single" w:sz="8" w:space="0" w:color="F1F5F9"/>
-            </w:tcBorders>
-          </w:tcPr>
-          <w:p>
+              <w:top w:val="single" w:color="F1F5F9" w:sz="8" w:space="0"/>
+              <w:bottom w:val="single" w:color="F1F5F9" w:sz="8" w:space="0"/>
+            </w:tcBorders>
+          </w:tcPr>
+          <w:p wp14:textId="77777777">
             <w:pPr>
               <w:pStyle w:val="normal1"/>
               <w:rPr/>
@@ -1495,11 +1532,11 @@
           <w:tcPr>
             <w:tcW w:w="3499" w:type="dxa"/>
             <w:tcBorders>
-              <w:top w:val="single" w:sz="8" w:space="0" w:color="F1F5F9"/>
-              <w:bottom w:val="single" w:sz="8" w:space="0" w:color="F1F5F9"/>
-            </w:tcBorders>
-          </w:tcPr>
-          <w:p>
+              <w:top w:val="single" w:color="F1F5F9" w:sz="8" w:space="0"/>
+              <w:bottom w:val="single" w:color="F1F5F9" w:sz="8" w:space="0"/>
+            </w:tcBorders>
+          </w:tcPr>
+          <w:p wp14:textId="77777777">
             <w:pPr>
               <w:pStyle w:val="normal1"/>
               <w:rPr/>
@@ -1516,12 +1553,12 @@
               <w:sdtContent>
                 <w:r>
                   <w:rPr>
-                    <w:shd w:fill="auto" w:val="clear"/>
+                    <w:shd w:val="clear" w:fill="auto"/>
                   </w:rPr>
                 </w:r>
                 <w:r>
                   <w:rPr>
-                    <w:shd w:fill="auto" w:val="clear"/>
+                    <w:shd w:val="clear" w:fill="auto"/>
                   </w:rPr>
                   <w:t>Alto</w:t>
                 </w:r>
@@ -1530,17 +1567,17 @@
           </w:p>
         </w:tc>
       </w:tr>
-      <w:tr>
+      <w:tr xmlns:wp14="http://schemas.microsoft.com/office/word/2010/wordml" wp14:textId="77777777">
         <w:trPr/>
         <w:tc>
           <w:tcPr>
             <w:tcW w:w="3500" w:type="dxa"/>
             <w:tcBorders>
-              <w:top w:val="single" w:sz="8" w:space="0" w:color="F1F5F9"/>
-              <w:bottom w:val="single" w:sz="8" w:space="0" w:color="F1F5F9"/>
-            </w:tcBorders>
-          </w:tcPr>
-          <w:p>
+              <w:top w:val="single" w:color="F1F5F9" w:sz="8" w:space="0"/>
+              <w:bottom w:val="single" w:color="F1F5F9" w:sz="8" w:space="0"/>
+            </w:tcBorders>
+          </w:tcPr>
+          <w:p wp14:textId="77777777">
             <w:pPr>
               <w:pStyle w:val="normal1"/>
               <w:rPr/>
@@ -1558,11 +1595,11 @@
           <w:tcPr>
             <w:tcW w:w="3500" w:type="dxa"/>
             <w:tcBorders>
-              <w:top w:val="single" w:sz="8" w:space="0" w:color="F1F5F9"/>
-              <w:bottom w:val="single" w:sz="8" w:space="0" w:color="F1F5F9"/>
-            </w:tcBorders>
-          </w:tcPr>
-          <w:p>
+              <w:top w:val="single" w:color="F1F5F9" w:sz="8" w:space="0"/>
+              <w:bottom w:val="single" w:color="F1F5F9" w:sz="8" w:space="0"/>
+            </w:tcBorders>
+          </w:tcPr>
+          <w:p wp14:textId="77777777">
             <w:pPr>
               <w:pStyle w:val="normal1"/>
               <w:rPr/>
@@ -1577,11 +1614,11 @@
           <w:tcPr>
             <w:tcW w:w="3500" w:type="dxa"/>
             <w:tcBorders>
-              <w:top w:val="single" w:sz="8" w:space="0" w:color="F1F5F9"/>
-              <w:bottom w:val="single" w:sz="8" w:space="0" w:color="F1F5F9"/>
-            </w:tcBorders>
-          </w:tcPr>
-          <w:p>
+              <w:top w:val="single" w:color="F1F5F9" w:sz="8" w:space="0"/>
+              <w:bottom w:val="single" w:color="F1F5F9" w:sz="8" w:space="0"/>
+            </w:tcBorders>
+          </w:tcPr>
+          <w:p wp14:textId="77777777">
             <w:pPr>
               <w:pStyle w:val="normal1"/>
               <w:rPr/>
@@ -1596,11 +1633,11 @@
           <w:tcPr>
             <w:tcW w:w="3499" w:type="dxa"/>
             <w:tcBorders>
-              <w:top w:val="single" w:sz="8" w:space="0" w:color="F1F5F9"/>
-              <w:bottom w:val="single" w:sz="8" w:space="0" w:color="F1F5F9"/>
-            </w:tcBorders>
-          </w:tcPr>
-          <w:p>
+              <w:top w:val="single" w:color="F1F5F9" w:sz="8" w:space="0"/>
+              <w:bottom w:val="single" w:color="F1F5F9" w:sz="8" w:space="0"/>
+            </w:tcBorders>
+          </w:tcPr>
+          <w:p wp14:textId="77777777">
             <w:pPr>
               <w:pStyle w:val="normal1"/>
               <w:rPr/>
@@ -1617,12 +1654,12 @@
               <w:sdtContent>
                 <w:r>
                   <w:rPr>
-                    <w:shd w:fill="auto" w:val="clear"/>
+                    <w:shd w:val="clear" w:fill="auto"/>
                   </w:rPr>
                 </w:r>
                 <w:r>
                   <w:rPr>
-                    <w:shd w:fill="auto" w:val="clear"/>
+                    <w:shd w:val="clear" w:fill="auto"/>
                   </w:rPr>
                   <w:t>Médio</w:t>
                 </w:r>
@@ -1631,17 +1668,17 @@
           </w:p>
         </w:tc>
       </w:tr>
-      <w:tr>
+      <w:tr xmlns:wp14="http://schemas.microsoft.com/office/word/2010/wordml" wp14:textId="77777777">
         <w:trPr/>
         <w:tc>
           <w:tcPr>
             <w:tcW w:w="3500" w:type="dxa"/>
             <w:tcBorders>
-              <w:top w:val="single" w:sz="8" w:space="0" w:color="F1F5F9"/>
-              <w:bottom w:val="single" w:sz="8" w:space="0" w:color="E2E8F0"/>
-            </w:tcBorders>
-          </w:tcPr>
-          <w:p>
+              <w:top w:val="single" w:color="F1F5F9" w:sz="8" w:space="0"/>
+              <w:bottom w:val="single" w:color="E2E8F0" w:sz="8" w:space="0"/>
+            </w:tcBorders>
+          </w:tcPr>
+          <w:p wp14:textId="77777777">
             <w:pPr>
               <w:pStyle w:val="normal1"/>
               <w:rPr/>
@@ -1659,11 +1696,11 @@
           <w:tcPr>
             <w:tcW w:w="3500" w:type="dxa"/>
             <w:tcBorders>
-              <w:top w:val="single" w:sz="8" w:space="0" w:color="F1F5F9"/>
-              <w:bottom w:val="single" w:sz="8" w:space="0" w:color="E2E8F0"/>
-            </w:tcBorders>
-          </w:tcPr>
-          <w:p>
+              <w:top w:val="single" w:color="F1F5F9" w:sz="8" w:space="0"/>
+              <w:bottom w:val="single" w:color="E2E8F0" w:sz="8" w:space="0"/>
+            </w:tcBorders>
+          </w:tcPr>
+          <w:p wp14:textId="77777777">
             <w:pPr>
               <w:pStyle w:val="normal1"/>
               <w:rPr/>
@@ -1678,11 +1715,11 @@
           <w:tcPr>
             <w:tcW w:w="3500" w:type="dxa"/>
             <w:tcBorders>
-              <w:top w:val="single" w:sz="8" w:space="0" w:color="F1F5F9"/>
-              <w:bottom w:val="single" w:sz="8" w:space="0" w:color="E2E8F0"/>
-            </w:tcBorders>
-          </w:tcPr>
-          <w:p>
+              <w:top w:val="single" w:color="F1F5F9" w:sz="8" w:space="0"/>
+              <w:bottom w:val="single" w:color="E2E8F0" w:sz="8" w:space="0"/>
+            </w:tcBorders>
+          </w:tcPr>
+          <w:p wp14:textId="77777777">
             <w:pPr>
               <w:pStyle w:val="normal1"/>
               <w:rPr/>
@@ -1708,11 +1745,11 @@
           <w:tcPr>
             <w:tcW w:w="3499" w:type="dxa"/>
             <w:tcBorders>
-              <w:top w:val="single" w:sz="8" w:space="0" w:color="F1F5F9"/>
-              <w:bottom w:val="single" w:sz="8" w:space="0" w:color="E2E8F0"/>
-            </w:tcBorders>
-          </w:tcPr>
-          <w:p>
+              <w:top w:val="single" w:color="F1F5F9" w:sz="8" w:space="0"/>
+              <w:bottom w:val="single" w:color="E2E8F0" w:sz="8" w:space="0"/>
+            </w:tcBorders>
+          </w:tcPr>
+          <w:p wp14:textId="77777777">
             <w:pPr>
               <w:pStyle w:val="normal1"/>
               <w:rPr/>
@@ -1729,12 +1766,12 @@
               <w:sdtContent>
                 <w:r>
                   <w:rPr>
-                    <w:shd w:fill="auto" w:val="clear"/>
+                    <w:shd w:val="clear" w:fill="auto"/>
                   </w:rPr>
                 </w:r>
                 <w:r>
                   <w:rPr>
-                    <w:shd w:fill="auto" w:val="clear"/>
+                    <w:shd w:val="clear" w:fill="auto"/>
                   </w:rPr>
                   <w:t>Médio</w:t>
                 </w:r>
@@ -1744,26 +1781,26 @@
         </w:tc>
       </w:tr>
     </w:tbl>
-    <w:p>
+    <w:p xmlns:wp14="http://schemas.microsoft.com/office/word/2010/wordml" wp14:textId="77777777">
       <w:pPr>
         <w:pStyle w:val="Heading2"/>
         <w:rPr/>
       </w:pPr>
-      <w:bookmarkStart w:id="15" w:name="_h8oa8p5g2ejn"/>
+      <w:bookmarkStart w:name="_h8oa8p5g2ejn" w:id="15"/>
       <w:bookmarkEnd w:id="15"/>
       <w:r>
         <w:rPr/>
         <w:t>3.4. Fluxo Operacional Futuro (To-Be)</w:t>
       </w:r>
     </w:p>
-    <w:p>
+    <w:p xmlns:wp14="http://schemas.microsoft.com/office/word/2010/wordml" wp14:textId="77777777">
       <w:pPr>
         <w:pStyle w:val="normal1"/>
         <w:numPr>
           <w:ilvl w:val="0"/>
           <w:numId w:val="5"/>
         </w:numPr>
-        <w:ind w:hanging="360" w:left="720"/>
+        <w:ind w:left="720" w:hanging="360"/>
         <w:rPr/>
       </w:pPr>
       <w:r>
@@ -1778,14 +1815,14 @@
         <w:t xml:space="preserve"> O utente (diretamente ou via canal telefónico assistido) ou o técnico do lar parceiro submete o pedido de transporte com antecedência, parametrizando as especificidades do utente (ex.: necessidade de suporte físico, cadeira de rodas, transporte de oxigénio ou condicionantes visuais).</w:t>
       </w:r>
     </w:p>
-    <w:p>
+    <w:p xmlns:wp14="http://schemas.microsoft.com/office/word/2010/wordml" wp14:textId="77777777">
       <w:pPr>
         <w:pStyle w:val="normal1"/>
         <w:numPr>
           <w:ilvl w:val="0"/>
           <w:numId w:val="5"/>
         </w:numPr>
-        <w:ind w:hanging="360" w:left="720"/>
+        <w:ind w:left="720" w:hanging="360"/>
         <w:rPr/>
       </w:pPr>
       <w:r>
@@ -1800,14 +1837,14 @@
         <w:t xml:space="preserve"> O motor de regras da plataforma verifica os critérios de elegibilidade (incluindo eventual enquadramento no TNUD/SNS) e efetua a alocação do recurso seguindo a hierarquia de prioridades:</w:t>
       </w:r>
     </w:p>
-    <w:p>
+    <w:p xmlns:wp14="http://schemas.microsoft.com/office/word/2010/wordml" wp14:textId="77777777">
       <w:pPr>
         <w:pStyle w:val="normal1"/>
         <w:numPr>
           <w:ilvl w:val="1"/>
           <w:numId w:val="5"/>
         </w:numPr>
-        <w:ind w:hanging="360" w:left="1440"/>
+        <w:ind w:left="1440" w:hanging="360"/>
         <w:rPr/>
       </w:pPr>
       <w:r>
@@ -1822,14 +1859,14 @@
         <w:t xml:space="preserve"> Condutor Voluntário em veículo próprio (para utentes com mobilidade Ligeira/Média).</w:t>
       </w:r>
     </w:p>
-    <w:p>
+    <w:p xmlns:wp14="http://schemas.microsoft.com/office/word/2010/wordml" wp14:textId="77777777">
       <w:pPr>
         <w:pStyle w:val="normal1"/>
         <w:numPr>
           <w:ilvl w:val="1"/>
           <w:numId w:val="5"/>
         </w:numPr>
-        <w:ind w:hanging="360" w:left="1440"/>
+        <w:ind w:left="1440" w:hanging="360"/>
         <w:rPr/>
       </w:pPr>
       <w:r>
@@ -1844,14 +1881,14 @@
         <w:t xml:space="preserve"> Viatura Adaptada de Parceiro Social/Municipal (para utentes em cadeira de rodas ou mobilidade reduzida Severa).</w:t>
       </w:r>
     </w:p>
-    <w:p>
+    <w:p xmlns:wp14="http://schemas.microsoft.com/office/word/2010/wordml" wp14:textId="77777777">
       <w:pPr>
         <w:pStyle w:val="normal1"/>
         <w:numPr>
           <w:ilvl w:val="1"/>
           <w:numId w:val="5"/>
         </w:numPr>
-        <w:ind w:hanging="360" w:left="1440"/>
+        <w:ind w:left="1440" w:hanging="360"/>
         <w:rPr/>
       </w:pPr>
       <w:r>
@@ -1866,14 +1903,14 @@
         <w:t xml:space="preserve"> Operador de Recurso (Táxi/TVDE parceiro com tarifa convencionada), acionado apenas em caso de indisponibilidade da rede social.</w:t>
       </w:r>
     </w:p>
-    <w:p>
+    <w:p xmlns:wp14="http://schemas.microsoft.com/office/word/2010/wordml" wp14:textId="77777777">
       <w:pPr>
         <w:pStyle w:val="normal1"/>
         <w:numPr>
           <w:ilvl w:val="0"/>
           <w:numId w:val="5"/>
         </w:numPr>
-        <w:ind w:hanging="360" w:left="720"/>
+        <w:ind w:left="720" w:hanging="360"/>
         <w:rPr/>
       </w:pPr>
       <w:r>
@@ -1899,14 +1936,14 @@
         <w:t>. Durante o ato médico, a viatura/condutor fica liberada para outras missões de curto curso. Ao finalizar a consulta, o profissional hospitalar ou o utente aciona o sinal de "Fim de Consulta", notificando o sistema para gerar a rota de regresso do condutor atribuído.</w:t>
       </w:r>
     </w:p>
-    <w:p>
+    <w:p xmlns:wp14="http://schemas.microsoft.com/office/word/2010/wordml" wp14:textId="77777777">
       <w:pPr>
         <w:pStyle w:val="normal1"/>
         <w:numPr>
           <w:ilvl w:val="0"/>
           <w:numId w:val="5"/>
         </w:numPr>
-        <w:ind w:hanging="360" w:left="720"/>
+        <w:ind w:left="720" w:hanging="360"/>
         <w:rPr/>
       </w:pPr>
       <w:r>
@@ -1921,12 +1958,12 @@
         <w:t xml:space="preserve"> Concluído o desembarque do utente no domicílio, o condutor encerra a viagem na App. O sistema calcula a duração e líquida automaticamente o crédito correspondente de horas na conta do Banco de Tempo do voluntário.</w:t>
       </w:r>
     </w:p>
-    <w:p>
+    <w:p xmlns:wp14="http://schemas.microsoft.com/office/word/2010/wordml" wp14:textId="77777777">
       <w:pPr>
         <w:pStyle w:val="Heading1"/>
         <w:rPr/>
       </w:pPr>
-      <w:bookmarkStart w:id="16" w:name="_xzoatu56ppa"/>
+      <w:bookmarkStart w:name="_xzoatu56ppa" w:id="16"/>
       <w:bookmarkEnd w:id="16"/>
       <w:r>
         <w:rPr/>
@@ -1953,7 +1990,7 @@
         <w:gridCol w:w="3500"/>
         <w:gridCol w:w="3500"/>
       </w:tblGrid>
-      <w:tr>
+      <w:tr xmlns:wp14="http://schemas.microsoft.com/office/word/2010/wordml" wp14:textId="77777777">
         <w:trPr>
           <w:tblHeader w:val="true"/>
         </w:trPr>
@@ -1961,11 +1998,11 @@
           <w:tcPr>
             <w:tcW w:w="3500" w:type="dxa"/>
             <w:tcBorders>
-              <w:top w:val="single" w:sz="8" w:space="0" w:color="E2E8F0"/>
-              <w:bottom w:val="single" w:sz="8" w:space="0" w:color="F1F5F9"/>
-            </w:tcBorders>
-          </w:tcPr>
-          <w:p>
+              <w:top w:val="single" w:color="E2E8F0" w:sz="8" w:space="0"/>
+              <w:bottom w:val="single" w:color="F1F5F9" w:sz="8" w:space="0"/>
+            </w:tcBorders>
+          </w:tcPr>
+          <w:p wp14:textId="77777777">
             <w:pPr>
               <w:pStyle w:val="normal1"/>
               <w:rPr/>
@@ -1980,11 +2017,11 @@
           <w:tcPr>
             <w:tcW w:w="3500" w:type="dxa"/>
             <w:tcBorders>
-              <w:top w:val="single" w:sz="8" w:space="0" w:color="E2E8F0"/>
-              <w:bottom w:val="single" w:sz="8" w:space="0" w:color="F1F5F9"/>
-            </w:tcBorders>
-          </w:tcPr>
-          <w:p>
+              <w:top w:val="single" w:color="E2E8F0" w:sz="8" w:space="0"/>
+              <w:bottom w:val="single" w:color="F1F5F9" w:sz="8" w:space="0"/>
+            </w:tcBorders>
+          </w:tcPr>
+          <w:p wp14:textId="77777777">
             <w:pPr>
               <w:pStyle w:val="normal1"/>
               <w:rPr/>
@@ -1999,11 +2036,11 @@
           <w:tcPr>
             <w:tcW w:w="3500" w:type="dxa"/>
             <w:tcBorders>
-              <w:top w:val="single" w:sz="8" w:space="0" w:color="E2E8F0"/>
-              <w:bottom w:val="single" w:sz="8" w:space="0" w:color="F1F5F9"/>
-            </w:tcBorders>
-          </w:tcPr>
-          <w:p>
+              <w:top w:val="single" w:color="E2E8F0" w:sz="8" w:space="0"/>
+              <w:bottom w:val="single" w:color="F1F5F9" w:sz="8" w:space="0"/>
+            </w:tcBorders>
+          </w:tcPr>
+          <w:p wp14:textId="77777777">
             <w:pPr>
               <w:pStyle w:val="normal1"/>
               <w:rPr/>
@@ -2015,17 +2052,17 @@
           </w:p>
         </w:tc>
       </w:tr>
-      <w:tr>
+      <w:tr xmlns:wp14="http://schemas.microsoft.com/office/word/2010/wordml" wp14:textId="77777777">
         <w:trPr/>
         <w:tc>
           <w:tcPr>
             <w:tcW w:w="3500" w:type="dxa"/>
             <w:tcBorders>
-              <w:top w:val="single" w:sz="8" w:space="0" w:color="F1F5F9"/>
-              <w:bottom w:val="single" w:sz="8" w:space="0" w:color="F1F5F9"/>
-            </w:tcBorders>
-          </w:tcPr>
-          <w:p>
+              <w:top w:val="single" w:color="F1F5F9" w:sz="8" w:space="0"/>
+              <w:bottom w:val="single" w:color="F1F5F9" w:sz="8" w:space="0"/>
+            </w:tcBorders>
+          </w:tcPr>
+          <w:p wp14:textId="77777777">
             <w:pPr>
               <w:pStyle w:val="normal1"/>
               <w:rPr/>
@@ -2043,11 +2080,11 @@
           <w:tcPr>
             <w:tcW w:w="3500" w:type="dxa"/>
             <w:tcBorders>
-              <w:top w:val="single" w:sz="8" w:space="0" w:color="F1F5F9"/>
-              <w:bottom w:val="single" w:sz="8" w:space="0" w:color="F1F5F9"/>
-            </w:tcBorders>
-          </w:tcPr>
-          <w:p>
+              <w:top w:val="single" w:color="F1F5F9" w:sz="8" w:space="0"/>
+              <w:bottom w:val="single" w:color="F1F5F9" w:sz="8" w:space="0"/>
+            </w:tcBorders>
+          </w:tcPr>
+          <w:p wp14:textId="77777777">
             <w:pPr>
               <w:pStyle w:val="normal1"/>
               <w:rPr/>
@@ -2062,11 +2099,11 @@
           <w:tcPr>
             <w:tcW w:w="3500" w:type="dxa"/>
             <w:tcBorders>
-              <w:top w:val="single" w:sz="8" w:space="0" w:color="F1F5F9"/>
-              <w:bottom w:val="single" w:sz="8" w:space="0" w:color="F1F5F9"/>
-            </w:tcBorders>
-          </w:tcPr>
-          <w:p>
+              <w:top w:val="single" w:color="F1F5F9" w:sz="8" w:space="0"/>
+              <w:bottom w:val="single" w:color="F1F5F9" w:sz="8" w:space="0"/>
+            </w:tcBorders>
+          </w:tcPr>
+          <w:p wp14:textId="77777777">
             <w:pPr>
               <w:pStyle w:val="normal1"/>
               <w:rPr/>
@@ -2093,17 +2130,17 @@
           </w:p>
         </w:tc>
       </w:tr>
-      <w:tr>
+      <w:tr xmlns:wp14="http://schemas.microsoft.com/office/word/2010/wordml" wp14:textId="77777777">
         <w:trPr/>
         <w:tc>
           <w:tcPr>
             <w:tcW w:w="3500" w:type="dxa"/>
             <w:tcBorders>
-              <w:top w:val="single" w:sz="8" w:space="0" w:color="F1F5F9"/>
-              <w:bottom w:val="single" w:sz="8" w:space="0" w:color="F1F5F9"/>
-            </w:tcBorders>
-          </w:tcPr>
-          <w:p>
+              <w:top w:val="single" w:color="F1F5F9" w:sz="8" w:space="0"/>
+              <w:bottom w:val="single" w:color="F1F5F9" w:sz="8" w:space="0"/>
+            </w:tcBorders>
+          </w:tcPr>
+          <w:p wp14:textId="77777777">
             <w:pPr>
               <w:pStyle w:val="normal1"/>
               <w:rPr/>
@@ -2121,11 +2158,11 @@
           <w:tcPr>
             <w:tcW w:w="3500" w:type="dxa"/>
             <w:tcBorders>
-              <w:top w:val="single" w:sz="8" w:space="0" w:color="F1F5F9"/>
-              <w:bottom w:val="single" w:sz="8" w:space="0" w:color="F1F5F9"/>
-            </w:tcBorders>
-          </w:tcPr>
-          <w:p>
+              <w:top w:val="single" w:color="F1F5F9" w:sz="8" w:space="0"/>
+              <w:bottom w:val="single" w:color="F1F5F9" w:sz="8" w:space="0"/>
+            </w:tcBorders>
+          </w:tcPr>
+          <w:p wp14:textId="77777777">
             <w:pPr>
               <w:pStyle w:val="normal1"/>
               <w:rPr/>
@@ -2140,11 +2177,11 @@
           <w:tcPr>
             <w:tcW w:w="3500" w:type="dxa"/>
             <w:tcBorders>
-              <w:top w:val="single" w:sz="8" w:space="0" w:color="F1F5F9"/>
-              <w:bottom w:val="single" w:sz="8" w:space="0" w:color="F1F5F9"/>
-            </w:tcBorders>
-          </w:tcPr>
-          <w:p>
+              <w:top w:val="single" w:color="F1F5F9" w:sz="8" w:space="0"/>
+              <w:bottom w:val="single" w:color="F1F5F9" w:sz="8" w:space="0"/>
+            </w:tcBorders>
+          </w:tcPr>
+          <w:p wp14:textId="77777777">
             <w:pPr>
               <w:pStyle w:val="normal1"/>
               <w:rPr/>
@@ -2163,17 +2200,17 @@
           </w:p>
         </w:tc>
       </w:tr>
-      <w:tr>
+      <w:tr xmlns:wp14="http://schemas.microsoft.com/office/word/2010/wordml" wp14:textId="77777777">
         <w:trPr/>
         <w:tc>
           <w:tcPr>
             <w:tcW w:w="3500" w:type="dxa"/>
             <w:tcBorders>
-              <w:top w:val="single" w:sz="8" w:space="0" w:color="F1F5F9"/>
-              <w:bottom w:val="single" w:sz="8" w:space="0" w:color="E2E8F0"/>
-            </w:tcBorders>
-          </w:tcPr>
-          <w:p>
+              <w:top w:val="single" w:color="F1F5F9" w:sz="8" w:space="0"/>
+              <w:bottom w:val="single" w:color="E2E8F0" w:sz="8" w:space="0"/>
+            </w:tcBorders>
+          </w:tcPr>
+          <w:p wp14:textId="77777777">
             <w:pPr>
               <w:pStyle w:val="normal1"/>
               <w:rPr/>
@@ -2191,11 +2228,11 @@
           <w:tcPr>
             <w:tcW w:w="3500" w:type="dxa"/>
             <w:tcBorders>
-              <w:top w:val="single" w:sz="8" w:space="0" w:color="F1F5F9"/>
-              <w:bottom w:val="single" w:sz="8" w:space="0" w:color="E2E8F0"/>
-            </w:tcBorders>
-          </w:tcPr>
-          <w:p>
+              <w:top w:val="single" w:color="F1F5F9" w:sz="8" w:space="0"/>
+              <w:bottom w:val="single" w:color="E2E8F0" w:sz="8" w:space="0"/>
+            </w:tcBorders>
+          </w:tcPr>
+          <w:p wp14:textId="77777777">
             <w:pPr>
               <w:pStyle w:val="normal1"/>
               <w:rPr/>
@@ -2210,11 +2247,11 @@
           <w:tcPr>
             <w:tcW w:w="3500" w:type="dxa"/>
             <w:tcBorders>
-              <w:top w:val="single" w:sz="8" w:space="0" w:color="F1F5F9"/>
-              <w:bottom w:val="single" w:sz="8" w:space="0" w:color="E2E8F0"/>
-            </w:tcBorders>
-          </w:tcPr>
-          <w:p>
+              <w:top w:val="single" w:color="F1F5F9" w:sz="8" w:space="0"/>
+              <w:bottom w:val="single" w:color="E2E8F0" w:sz="8" w:space="0"/>
+            </w:tcBorders>
+          </w:tcPr>
+          <w:p wp14:textId="77777777">
             <w:pPr>
               <w:pStyle w:val="normal1"/>
               <w:rPr/>
@@ -2245,31 +2282,31 @@
         </w:tc>
       </w:tr>
     </w:tbl>
-    <w:p>
+    <w:p xmlns:wp14="http://schemas.microsoft.com/office/word/2010/wordml" wp14:textId="77777777">
       <w:pPr>
         <w:pStyle w:val="Heading1"/>
         <w:rPr/>
       </w:pPr>
-      <w:bookmarkStart w:id="17" w:name="_6daepktf3z1s"/>
+      <w:bookmarkStart w:name="_6daepktf3z1s" w:id="17"/>
       <w:bookmarkEnd w:id="17"/>
       <w:r>
         <w:rPr/>
         <w:t>5. Arquitetura Funcional e Roadmap de Desenvolvimento</w:t>
       </w:r>
     </w:p>
-    <w:p>
+    <w:p xmlns:wp14="http://schemas.microsoft.com/office/word/2010/wordml" wp14:textId="77777777">
       <w:pPr>
         <w:pStyle w:val="Heading2"/>
         <w:rPr/>
       </w:pPr>
-      <w:bookmarkStart w:id="18" w:name="_5mdpf62a7xsr"/>
+      <w:bookmarkStart w:name="_5mdpf62a7xsr" w:id="18"/>
       <w:bookmarkEnd w:id="18"/>
       <w:r>
         <w:rPr/>
         <w:t>5.1. Estrutura de Épicos de Desenvolvimento</w:t>
       </w:r>
     </w:p>
-    <w:p>
+    <w:p xmlns:wp14="http://schemas.microsoft.com/office/word/2010/wordml" wp14:textId="77777777">
       <w:pPr>
         <w:pStyle w:val="normal1"/>
         <w:rPr/>
@@ -2279,7 +2316,7 @@
         <w:t>[MobiAssiste Platform]</w:t>
       </w:r>
     </w:p>
-    <w:p>
+    <w:p xmlns:wp14="http://schemas.microsoft.com/office/word/2010/wordml" wp14:textId="77777777">
       <w:pPr>
         <w:pStyle w:val="normal1"/>
         <w:keepNext w:val="false"/>
@@ -2288,8 +2325,8 @@
         <w:widowControl w:val="false"/>
         <w:pBdr/>
         <w:shd w:val="clear" w:fill="auto"/>
-        <w:spacing w:lineRule="auto" w:line="276" w:before="0" w:after="0"/>
-        <w:ind w:hanging="0" w:left="0" w:right="0"/>
+        <w:spacing w:before="0" w:after="0" w:line="276" w:lineRule="auto"/>
+        <w:ind w:left="0" w:right="0" w:hanging="0"/>
         <w:jc w:val="left"/>
         <w:rPr/>
       </w:pPr>
@@ -2297,7 +2334,7 @@
         <w:rPr/>
       </w:r>
     </w:p>
-    <w:p>
+    <w:p xmlns:wp14="http://schemas.microsoft.com/office/word/2010/wordml" wp14:textId="77777777">
       <w:pPr>
         <w:pStyle w:val="normal1"/>
         <w:rPr/>
@@ -2311,7 +2348,7 @@
         <w:t>Épico #1: Gestão de Perfis &amp; Triagem Assistida</w:t>
       </w:r>
     </w:p>
-    <w:p>
+    <w:p xmlns:wp14="http://schemas.microsoft.com/office/word/2010/wordml" wp14:textId="77777777">
       <w:pPr>
         <w:pStyle w:val="normal1"/>
         <w:keepNext w:val="false"/>
@@ -2320,8 +2357,8 @@
         <w:widowControl w:val="false"/>
         <w:pBdr/>
         <w:shd w:val="clear" w:fill="auto"/>
-        <w:spacing w:lineRule="auto" w:line="276" w:before="0" w:after="0"/>
-        <w:ind w:hanging="0" w:left="0" w:right="0"/>
+        <w:spacing w:before="0" w:after="0" w:line="276" w:lineRule="auto"/>
+        <w:ind w:left="0" w:right="0" w:hanging="0"/>
         <w:jc w:val="left"/>
         <w:rPr/>
       </w:pPr>
@@ -2329,7 +2366,7 @@
         <w:rPr/>
       </w:r>
     </w:p>
-    <w:p>
+    <w:p xmlns:wp14="http://schemas.microsoft.com/office/word/2010/wordml" wp14:textId="77777777">
       <w:pPr>
         <w:pStyle w:val="normal1"/>
         <w:rPr/>
@@ -2343,7 +2380,7 @@
         <w:t>Épico #2: Engine de Matching &amp; Frota Híbrida</w:t>
       </w:r>
     </w:p>
-    <w:p>
+    <w:p xmlns:wp14="http://schemas.microsoft.com/office/word/2010/wordml" wp14:textId="77777777">
       <w:pPr>
         <w:pStyle w:val="normal1"/>
         <w:keepNext w:val="false"/>
@@ -2352,8 +2389,8 @@
         <w:widowControl w:val="false"/>
         <w:pBdr/>
         <w:shd w:val="clear" w:fill="auto"/>
-        <w:spacing w:lineRule="auto" w:line="276" w:before="0" w:after="0"/>
-        <w:ind w:hanging="0" w:left="0" w:right="0"/>
+        <w:spacing w:before="0" w:after="0" w:line="276" w:lineRule="auto"/>
+        <w:ind w:left="0" w:right="0" w:hanging="0"/>
         <w:jc w:val="left"/>
         <w:rPr/>
       </w:pPr>
@@ -2361,7 +2398,7 @@
         <w:rPr/>
       </w:r>
     </w:p>
-    <w:p>
+    <w:p xmlns:wp14="http://schemas.microsoft.com/office/word/2010/wordml" wp14:textId="77777777">
       <w:pPr>
         <w:pStyle w:val="normal1"/>
         <w:rPr/>
@@ -2375,7 +2412,7 @@
         <w:t>Épico #3: App do Voluntário &amp; Banco de Tempo</w:t>
       </w:r>
     </w:p>
-    <w:p>
+    <w:p xmlns:wp14="http://schemas.microsoft.com/office/word/2010/wordml" wp14:textId="77777777">
       <w:pPr>
         <w:pStyle w:val="normal1"/>
         <w:keepNext w:val="false"/>
@@ -2384,8 +2421,8 @@
         <w:widowControl w:val="false"/>
         <w:pBdr/>
         <w:shd w:val="clear" w:fill="auto"/>
-        <w:spacing w:lineRule="auto" w:line="276" w:before="0" w:after="0"/>
-        <w:ind w:hanging="0" w:left="0" w:right="0"/>
+        <w:spacing w:before="0" w:after="0" w:line="276" w:lineRule="auto"/>
+        <w:ind w:left="0" w:right="0" w:hanging="0"/>
         <w:jc w:val="left"/>
         <w:rPr/>
       </w:pPr>
@@ -2393,7 +2430,7 @@
         <w:rPr/>
       </w:r>
     </w:p>
-    <w:p>
+    <w:p xmlns:wp14="http://schemas.microsoft.com/office/word/2010/wordml" wp14:textId="77777777">
       <w:pPr>
         <w:pStyle w:val="normal1"/>
         <w:rPr/>
@@ -2407,26 +2444,26 @@
         <w:t>Épico #4: Módulo IoT Hospitalar &amp; Telemática</w:t>
       </w:r>
     </w:p>
-    <w:p>
+    <w:p xmlns:wp14="http://schemas.microsoft.com/office/word/2010/wordml" wp14:textId="77777777">
       <w:pPr>
         <w:pStyle w:val="Heading3"/>
         <w:rPr/>
       </w:pPr>
-      <w:bookmarkStart w:id="19" w:name="_iltqwzuq6cwc"/>
+      <w:bookmarkStart w:name="_iltqwzuq6cwc" w:id="19"/>
       <w:bookmarkEnd w:id="19"/>
       <w:r>
         <w:rPr/>
         <w:t>Épico #1: Gestão de Perfis e Triagem Assistida</w:t>
       </w:r>
     </w:p>
-    <w:p>
+    <w:p xmlns:wp14="http://schemas.microsoft.com/office/word/2010/wordml" wp14:textId="77777777">
       <w:pPr>
         <w:pStyle w:val="normal1"/>
         <w:numPr>
           <w:ilvl w:val="0"/>
           <w:numId w:val="4"/>
         </w:numPr>
-        <w:ind w:hanging="360" w:left="720"/>
+        <w:ind w:left="720" w:hanging="360"/>
         <w:rPr/>
       </w:pPr>
       <w:r>
@@ -2441,14 +2478,14 @@
         <w:t xml:space="preserve"> Módulo de parametrização de perfis funcionais de utentes (condicionantes de mobilidade, autonomias e necessidades médicas específicas).</w:t>
       </w:r>
     </w:p>
-    <w:p>
+    <w:p xmlns:wp14="http://schemas.microsoft.com/office/word/2010/wordml" wp14:textId="77777777">
       <w:pPr>
         <w:pStyle w:val="normal1"/>
         <w:numPr>
           <w:ilvl w:val="0"/>
           <w:numId w:val="4"/>
         </w:numPr>
-        <w:ind w:hanging="360" w:left="720"/>
+        <w:ind w:left="720" w:hanging="360"/>
         <w:rPr/>
       </w:pPr>
       <w:r>
@@ -2463,26 +2500,26 @@
         <w:t xml:space="preserve"> Interfaces para apoio ao atendimento telefónico (Canais Assistidos), portal de submissão para lares/técnicos sociais e validação de regras de elegibilidade social e de saúde.</w:t>
       </w:r>
     </w:p>
-    <w:p>
+    <w:p xmlns:wp14="http://schemas.microsoft.com/office/word/2010/wordml" wp14:textId="77777777">
       <w:pPr>
         <w:pStyle w:val="Heading3"/>
         <w:rPr/>
       </w:pPr>
-      <w:bookmarkStart w:id="20" w:name="_s2dt20nc4o77"/>
+      <w:bookmarkStart w:name="_s2dt20nc4o77" w:id="20"/>
       <w:bookmarkEnd w:id="20"/>
       <w:r>
         <w:rPr/>
         <w:t>Épico #2: Engine de Matching e Gestão de Frota Híbrida</w:t>
       </w:r>
     </w:p>
-    <w:p>
+    <w:p xmlns:wp14="http://schemas.microsoft.com/office/word/2010/wordml" wp14:textId="77777777">
       <w:pPr>
         <w:pStyle w:val="normal1"/>
         <w:numPr>
           <w:ilvl w:val="0"/>
           <w:numId w:val="4"/>
         </w:numPr>
-        <w:ind w:hanging="360" w:left="720"/>
+        <w:ind w:left="720" w:hanging="360"/>
         <w:rPr/>
       </w:pPr>
       <w:r>
@@ -2497,14 +2534,14 @@
         <w:t xml:space="preserve"> Motor de regras de alocação e otimização de recursos de transporte.</w:t>
       </w:r>
     </w:p>
-    <w:p>
+    <w:p xmlns:wp14="http://schemas.microsoft.com/office/word/2010/wordml" wp14:textId="77777777">
       <w:pPr>
         <w:pStyle w:val="normal1"/>
         <w:numPr>
           <w:ilvl w:val="0"/>
           <w:numId w:val="4"/>
         </w:numPr>
-        <w:ind w:hanging="360" w:left="720"/>
+        <w:ind w:left="720" w:hanging="360"/>
         <w:rPr/>
       </w:pPr>
       <w:r>
@@ -2519,26 +2556,26 @@
         <w:t xml:space="preserve"> Algoritmo de cruzamento de necessidades x requisitos de viatura, gestão da frota de parceiros (Municípios, IPSS, Bombeiros), integração com operadores de contingência (Táxis/TVDE) e rotas de eficiência.</w:t>
       </w:r>
     </w:p>
-    <w:p>
+    <w:p xmlns:wp14="http://schemas.microsoft.com/office/word/2010/wordml" wp14:textId="77777777">
       <w:pPr>
         <w:pStyle w:val="Heading3"/>
         <w:rPr/>
       </w:pPr>
-      <w:bookmarkStart w:id="21" w:name="_bth01qm8mydd"/>
+      <w:bookmarkStart w:name="_bth01qm8mydd" w:id="21"/>
       <w:bookmarkEnd w:id="21"/>
       <w:r>
         <w:rPr/>
         <w:t>Épico #3: App Móvel do Voluntário e Banco de Tempo</w:t>
       </w:r>
     </w:p>
-    <w:p>
+    <w:p xmlns:wp14="http://schemas.microsoft.com/office/word/2010/wordml" wp14:textId="77777777">
       <w:pPr>
         <w:pStyle w:val="normal1"/>
         <w:numPr>
           <w:ilvl w:val="0"/>
           <w:numId w:val="4"/>
         </w:numPr>
-        <w:ind w:hanging="360" w:left="720"/>
+        <w:ind w:left="720" w:hanging="360"/>
         <w:rPr/>
       </w:pPr>
       <w:r>
@@ -2553,14 +2590,14 @@
         <w:t xml:space="preserve"> Aplicação móvel (iOS/Android) destinada aos condutores e módulo de incentivos comunitários.</w:t>
       </w:r>
     </w:p>
-    <w:p>
+    <w:p xmlns:wp14="http://schemas.microsoft.com/office/word/2010/wordml" wp14:textId="77777777">
       <w:pPr>
         <w:pStyle w:val="normal1"/>
         <w:numPr>
           <w:ilvl w:val="0"/>
           <w:numId w:val="4"/>
         </w:numPr>
-        <w:ind w:hanging="360" w:left="720"/>
+        <w:ind w:left="720" w:hanging="360"/>
         <w:rPr/>
       </w:pPr>
       <w:r>
@@ -2586,26 +2623,26 @@
         <w:t>, diário de bordo digital e contabilidade transparente de horas no Banco de Tempo.</w:t>
       </w:r>
     </w:p>
-    <w:p>
+    <w:p xmlns:wp14="http://schemas.microsoft.com/office/word/2010/wordml" wp14:textId="77777777">
       <w:pPr>
         <w:pStyle w:val="Heading3"/>
         <w:rPr/>
       </w:pPr>
-      <w:bookmarkStart w:id="22" w:name="_mi01j7obfpd3"/>
+      <w:bookmarkStart w:name="_mi01j7obfpd3" w:id="22"/>
       <w:bookmarkEnd w:id="22"/>
       <w:r>
         <w:rPr/>
         <w:t>Épico #4: Módulo IoT Hospitalar e Telemática</w:t>
       </w:r>
     </w:p>
-    <w:p>
+    <w:p xmlns:wp14="http://schemas.microsoft.com/office/word/2010/wordml" wp14:textId="77777777">
       <w:pPr>
         <w:pStyle w:val="normal1"/>
         <w:numPr>
           <w:ilvl w:val="0"/>
           <w:numId w:val="4"/>
         </w:numPr>
-        <w:ind w:hanging="360" w:left="720"/>
+        <w:ind w:left="720" w:hanging="360"/>
         <w:rPr/>
       </w:pPr>
       <w:r>
@@ -2620,14 +2657,14 @@
         <w:t xml:space="preserve"> Ecossistema de integração com o meio hospitalar e monitorização de frota.</w:t>
       </w:r>
     </w:p>
-    <w:p>
+    <w:p xmlns:wp14="http://schemas.microsoft.com/office/word/2010/wordml" wp14:textId="77777777">
       <w:pPr>
         <w:pStyle w:val="normal1"/>
         <w:numPr>
           <w:ilvl w:val="0"/>
           <w:numId w:val="4"/>
         </w:numPr>
-        <w:ind w:hanging="360" w:left="720"/>
+        <w:ind w:left="720" w:hanging="360"/>
         <w:rPr/>
       </w:pPr>
       <w:r>
@@ -2653,38 +2690,38 @@
         <w:t xml:space="preserve"> / Botão físico/virtual) para sinalização de "Fim de Consulta" em unidades de saúde e integração telemática GPS para rastreamento de viaturas em tempo real.</w:t>
       </w:r>
     </w:p>
-    <w:p>
+    <w:p xmlns:wp14="http://schemas.microsoft.com/office/word/2010/wordml" wp14:textId="77777777">
       <w:pPr>
         <w:pStyle w:val="Heading2"/>
         <w:rPr/>
       </w:pPr>
-      <w:bookmarkStart w:id="23" w:name="_axssvlppf8p9"/>
+      <w:bookmarkStart w:name="_axssvlppf8p9" w:id="23"/>
       <w:bookmarkEnd w:id="23"/>
       <w:r>
         <w:rPr/>
         <w:t>5.2. Pressupostos, Dependências e Limites do Sistema</w:t>
       </w:r>
     </w:p>
-    <w:p>
+    <w:p xmlns:wp14="http://schemas.microsoft.com/office/word/2010/wordml" wp14:textId="77777777">
       <w:pPr>
         <w:pStyle w:val="Heading3"/>
         <w:rPr/>
       </w:pPr>
-      <w:bookmarkStart w:id="24" w:name="_hst8t5mwyw6e"/>
+      <w:bookmarkStart w:name="_hst8t5mwyw6e" w:id="24"/>
       <w:bookmarkEnd w:id="24"/>
       <w:r>
         <w:rPr/>
         <w:t>Pressupostos e Dependências Críticas</w:t>
       </w:r>
     </w:p>
-    <w:p>
+    <w:p xmlns:wp14="http://schemas.microsoft.com/office/word/2010/wordml" wp14:textId="77777777">
       <w:pPr>
         <w:pStyle w:val="normal1"/>
         <w:numPr>
           <w:ilvl w:val="0"/>
           <w:numId w:val="4"/>
         </w:numPr>
-        <w:ind w:hanging="360" w:left="720"/>
+        <w:ind w:left="720" w:hanging="360"/>
         <w:rPr/>
       </w:pPr>
       <w:r>
@@ -2699,14 +2736,14 @@
         <w:t xml:space="preserve"> Cooperação das unidades de saúde parceiras para disponibilização ou utilização dos pontos de sinalização de "Fim de Consulta".</w:t>
       </w:r>
     </w:p>
-    <w:p>
+    <w:p xmlns:wp14="http://schemas.microsoft.com/office/word/2010/wordml" wp14:textId="77777777">
       <w:pPr>
         <w:pStyle w:val="normal1"/>
         <w:numPr>
           <w:ilvl w:val="0"/>
           <w:numId w:val="4"/>
         </w:numPr>
-        <w:ind w:hanging="360" w:left="720"/>
+        <w:ind w:left="720" w:hanging="360"/>
         <w:rPr/>
       </w:pPr>
       <w:r>
@@ -2721,14 +2758,14 @@
         <w:t xml:space="preserve"> Celebração de protocolos de cooperação com Municípios e IPSSs locais para disponibilização de viaturas adaptadas nos períodos de subaproveitamento.</w:t>
       </w:r>
     </w:p>
-    <w:p>
+    <w:p xmlns:wp14="http://schemas.microsoft.com/office/word/2010/wordml" wp14:textId="77777777">
       <w:pPr>
         <w:pStyle w:val="normal1"/>
         <w:numPr>
           <w:ilvl w:val="0"/>
           <w:numId w:val="4"/>
         </w:numPr>
-        <w:ind w:hanging="360" w:left="720"/>
+        <w:ind w:left="720" w:hanging="360"/>
         <w:rPr/>
       </w:pPr>
       <w:r>
@@ -2743,26 +2780,26 @@
         <w:t xml:space="preserve"> Existência de cobertura de rede de dados móveis nas zonas de atuação para comunicação contínua com a App do voluntário e módulos IoT.</w:t>
       </w:r>
     </w:p>
-    <w:p>
+    <w:p xmlns:wp14="http://schemas.microsoft.com/office/word/2010/wordml" wp14:textId="77777777">
       <w:pPr>
         <w:pStyle w:val="Heading3"/>
         <w:rPr/>
       </w:pPr>
-      <w:bookmarkStart w:id="25" w:name="_eoq5h52uhd1w"/>
+      <w:bookmarkStart w:name="_eoq5h52uhd1w" w:id="25"/>
       <w:bookmarkEnd w:id="25"/>
       <w:r>
         <w:rPr/>
         <w:t>Limites e Exclusões do Âmbito (Out-of-Scope)</w:t>
       </w:r>
     </w:p>
-    <w:p>
+    <w:p xmlns:wp14="http://schemas.microsoft.com/office/word/2010/wordml" wp14:textId="77777777">
       <w:pPr>
         <w:pStyle w:val="normal1"/>
         <w:numPr>
           <w:ilvl w:val="0"/>
           <w:numId w:val="4"/>
         </w:numPr>
-        <w:ind w:hanging="360" w:left="720"/>
+        <w:ind w:left="720" w:hanging="360"/>
         <w:rPr/>
       </w:pPr>
       <w:r>
@@ -2777,14 +2814,14 @@
         <w:t xml:space="preserve"> O sistema não realiza nem faz gestão de serviços de emergência ou socorro pré-hospitalar (competência exclusiva do INEM/112).</w:t>
       </w:r>
     </w:p>
-    <w:p>
+    <w:p xmlns:wp14="http://schemas.microsoft.com/office/word/2010/wordml" wp14:textId="77777777">
       <w:pPr>
         <w:pStyle w:val="normal1"/>
         <w:numPr>
           <w:ilvl w:val="0"/>
           <w:numId w:val="4"/>
         </w:numPr>
-        <w:ind w:hanging="360" w:left="720"/>
+        <w:ind w:left="720" w:hanging="360"/>
         <w:rPr/>
       </w:pPr>
       <w:r>
@@ -2799,7 +2836,7 @@
         <w:t xml:space="preserve"> Não faz parte do âmbito da gestão direta da manutenção mecânica, inspeções ou reparações dos veículos privados pertencentes aos voluntários.</w:t>
       </w:r>
     </w:p>
-    <w:p>
+    <w:p xmlns:wp14="http://schemas.microsoft.com/office/word/2010/wordml" wp14:textId="77777777">
       <w:pPr>
         <w:pStyle w:val="normal1"/>
         <w:rPr/>
@@ -2810,12 +2847,13 @@
     </w:p>
     <w:sectPr>
       <w:type w:val="nextPage"/>
-      <w:pgSz w:w="11906" w:h="16838"/>
-      <w:pgMar w:left="1440" w:right="1440" w:gutter="0" w:header="0" w:top="1440" w:footer="0" w:bottom="1440"/>
-      <w:pgNumType w:start="1" w:fmt="decimal"/>
+      <w:pgSz w:w="11906" w:h="16838" w:orient="portrait"/>
+      <w:pgMar w:top="1440" w:right="1440" w:bottom="1440" w:left="1440" w:header="0" w:footer="0" w:gutter="0"/>
+      <w:pgNumType w:fmt="decimal" w:start="1"/>
       <w:formProt w:val="false"/>
       <w:textDirection w:val="lrTb"/>
       <w:docGrid w:type="default" w:linePitch="100" w:charSpace="4096"/>
+      <w:cols w:num="1"/>
     </w:sectPr>
   </w:body>
 </w:document>
@@ -2836,7 +2874,7 @@
         <w:ind w:left="720" w:hanging="360"/>
       </w:pPr>
       <w:rPr>
-        <w:rFonts w:ascii="Arial" w:hAnsi="Arial" w:cs="Arial" w:hint="default"/>
+        <w:rFonts w:hint="default" w:ascii="Arial" w:hAnsi="Arial" w:cs="Arial"/>
         <w:smallCaps w:val="false"/>
         <w:caps w:val="false"/>
         <w:dstrike w:val="false"/>
@@ -2848,7 +2886,7 @@
         <w:i w:val="false"/>
         <w:u w:val="none"/>
         <w:b w:val="false"/>
-        <w:shd w:fill="auto" w:val="clear"/>
+        <w:shd w:val="clear" w:fill="auto"/>
         <w:szCs w:val="22"/>
         <w:iCs w:val="false"/>
         <w:bCs w:val="false"/>
@@ -2867,7 +2905,7 @@
         <w:ind w:left="1440" w:hanging="360"/>
       </w:pPr>
       <w:rPr>
-        <w:rFonts w:ascii="Arial" w:hAnsi="Arial" w:cs="Arial" w:hint="default"/>
+        <w:rFonts w:hint="default" w:ascii="Arial" w:hAnsi="Arial" w:cs="Arial"/>
         <w:smallCaps w:val="false"/>
         <w:caps w:val="false"/>
         <w:dstrike w:val="false"/>
@@ -2879,7 +2917,7 @@
         <w:i w:val="false"/>
         <w:u w:val="none"/>
         <w:b w:val="false"/>
-        <w:shd w:fill="auto" w:val="clear"/>
+        <w:shd w:val="clear" w:fill="auto"/>
         <w:szCs w:val="22"/>
         <w:iCs w:val="false"/>
         <w:bCs w:val="false"/>
@@ -2898,7 +2936,7 @@
         <w:ind w:left="2160" w:hanging="360"/>
       </w:pPr>
       <w:rPr>
-        <w:rFonts w:ascii="Arial" w:hAnsi="Arial" w:cs="Arial" w:hint="default"/>
+        <w:rFonts w:hint="default" w:ascii="Arial" w:hAnsi="Arial" w:cs="Arial"/>
         <w:smallCaps w:val="false"/>
         <w:caps w:val="false"/>
         <w:dstrike w:val="false"/>
@@ -2910,7 +2948,7 @@
         <w:i w:val="false"/>
         <w:u w:val="none"/>
         <w:b w:val="false"/>
-        <w:shd w:fill="auto" w:val="clear"/>
+        <w:shd w:val="clear" w:fill="auto"/>
         <w:szCs w:val="22"/>
         <w:iCs w:val="false"/>
         <w:bCs w:val="false"/>
@@ -2929,7 +2967,7 @@
         <w:ind w:left="2880" w:hanging="360"/>
       </w:pPr>
       <w:rPr>
-        <w:rFonts w:ascii="Arial" w:hAnsi="Arial" w:cs="Arial" w:hint="default"/>
+        <w:rFonts w:hint="default" w:ascii="Arial" w:hAnsi="Arial" w:cs="Arial"/>
         <w:smallCaps w:val="false"/>
         <w:caps w:val="false"/>
         <w:dstrike w:val="false"/>
@@ -2941,7 +2979,7 @@
         <w:i w:val="false"/>
         <w:u w:val="none"/>
         <w:b w:val="false"/>
-        <w:shd w:fill="auto" w:val="clear"/>
+        <w:shd w:val="clear" w:fill="auto"/>
         <w:szCs w:val="22"/>
         <w:iCs w:val="false"/>
         <w:bCs w:val="false"/>
@@ -2960,7 +2998,7 @@
         <w:ind w:left="3600" w:hanging="360"/>
       </w:pPr>
       <w:rPr>
-        <w:rFonts w:ascii="Arial" w:hAnsi="Arial" w:cs="Arial" w:hint="default"/>
+        <w:rFonts w:hint="default" w:ascii="Arial" w:hAnsi="Arial" w:cs="Arial"/>
         <w:smallCaps w:val="false"/>
         <w:caps w:val="false"/>
         <w:dstrike w:val="false"/>
@@ -2972,7 +3010,7 @@
         <w:i w:val="false"/>
         <w:u w:val="none"/>
         <w:b w:val="false"/>
-        <w:shd w:fill="auto" w:val="clear"/>
+        <w:shd w:val="clear" w:fill="auto"/>
         <w:szCs w:val="22"/>
         <w:iCs w:val="false"/>
         <w:bCs w:val="false"/>
@@ -2991,7 +3029,7 @@
         <w:ind w:left="4320" w:hanging="360"/>
       </w:pPr>
       <w:rPr>
-        <w:rFonts w:ascii="Arial" w:hAnsi="Arial" w:cs="Arial" w:hint="default"/>
+        <w:rFonts w:hint="default" w:ascii="Arial" w:hAnsi="Arial" w:cs="Arial"/>
         <w:smallCaps w:val="false"/>
         <w:caps w:val="false"/>
         <w:dstrike w:val="false"/>
@@ -3003,7 +3041,7 @@
         <w:i w:val="false"/>
         <w:u w:val="none"/>
         <w:b w:val="false"/>
-        <w:shd w:fill="auto" w:val="clear"/>
+        <w:shd w:val="clear" w:fill="auto"/>
         <w:szCs w:val="22"/>
         <w:iCs w:val="false"/>
         <w:bCs w:val="false"/>
@@ -3022,7 +3060,7 @@
         <w:ind w:left="5040" w:hanging="360"/>
       </w:pPr>
       <w:rPr>
-        <w:rFonts w:ascii="Arial" w:hAnsi="Arial" w:cs="Arial" w:hint="default"/>
+        <w:rFonts w:hint="default" w:ascii="Arial" w:hAnsi="Arial" w:cs="Arial"/>
         <w:smallCaps w:val="false"/>
         <w:caps w:val="false"/>
         <w:dstrike w:val="false"/>
@@ -3034,7 +3072,7 @@
         <w:i w:val="false"/>
         <w:u w:val="none"/>
         <w:b w:val="false"/>
-        <w:shd w:fill="auto" w:val="clear"/>
+        <w:shd w:val="clear" w:fill="auto"/>
         <w:szCs w:val="22"/>
         <w:iCs w:val="false"/>
         <w:bCs w:val="false"/>
@@ -3053,7 +3091,7 @@
         <w:ind w:left="5760" w:hanging="360"/>
       </w:pPr>
       <w:rPr>
-        <w:rFonts w:ascii="Arial" w:hAnsi="Arial" w:cs="Arial" w:hint="default"/>
+        <w:rFonts w:hint="default" w:ascii="Arial" w:hAnsi="Arial" w:cs="Arial"/>
         <w:smallCaps w:val="false"/>
         <w:caps w:val="false"/>
         <w:dstrike w:val="false"/>
@@ -3065,7 +3103,7 @@
         <w:i w:val="false"/>
         <w:u w:val="none"/>
         <w:b w:val="false"/>
-        <w:shd w:fill="auto" w:val="clear"/>
+        <w:shd w:val="clear" w:fill="auto"/>
         <w:szCs w:val="22"/>
         <w:iCs w:val="false"/>
         <w:bCs w:val="false"/>
@@ -3084,7 +3122,7 @@
         <w:ind w:left="6480" w:hanging="360"/>
       </w:pPr>
       <w:rPr>
-        <w:rFonts w:ascii="Arial" w:hAnsi="Arial" w:cs="Arial" w:hint="default"/>
+        <w:rFonts w:hint="default" w:ascii="Arial" w:hAnsi="Arial" w:cs="Arial"/>
         <w:smallCaps w:val="false"/>
         <w:caps w:val="false"/>
         <w:dstrike w:val="false"/>
@@ -3096,13 +3134,14 @@
         <w:i w:val="false"/>
         <w:u w:val="none"/>
         <w:b w:val="false"/>
-        <w:shd w:fill="auto" w:val="clear"/>
+        <w:shd w:val="clear" w:fill="auto"/>
         <w:szCs w:val="22"/>
         <w:iCs w:val="false"/>
         <w:bCs w:val="false"/>
         <w:color w:val="000000"/>
       </w:rPr>
     </w:lvl>
+    <w:nsid w:val="254b12c8"/>
   </w:abstractNum>
   <w:abstractNum w:abstractNumId="2">
     <w:lvl w:ilvl="0">
@@ -3117,7 +3156,7 @@
         <w:ind w:left="720" w:hanging="360"/>
       </w:pPr>
       <w:rPr>
-        <w:rFonts w:ascii="Arial" w:hAnsi="Arial" w:cs="Arial" w:hint="default"/>
+        <w:rFonts w:hint="default" w:ascii="Arial" w:hAnsi="Arial" w:cs="Arial"/>
         <w:smallCaps w:val="false"/>
         <w:caps w:val="false"/>
         <w:dstrike w:val="false"/>
@@ -3129,7 +3168,7 @@
         <w:i w:val="false"/>
         <w:u w:val="none"/>
         <w:b w:val="false"/>
-        <w:shd w:fill="auto" w:val="clear"/>
+        <w:shd w:val="clear" w:fill="auto"/>
         <w:szCs w:val="22"/>
         <w:iCs w:val="false"/>
         <w:bCs w:val="false"/>
@@ -3148,7 +3187,7 @@
         <w:ind w:left="1440" w:hanging="360"/>
       </w:pPr>
       <w:rPr>
-        <w:rFonts w:ascii="Arial" w:hAnsi="Arial" w:cs="Arial" w:hint="default"/>
+        <w:rFonts w:hint="default" w:ascii="Arial" w:hAnsi="Arial" w:cs="Arial"/>
         <w:smallCaps w:val="false"/>
         <w:caps w:val="false"/>
         <w:dstrike w:val="false"/>
@@ -3160,7 +3199,7 @@
         <w:i w:val="false"/>
         <w:u w:val="none"/>
         <w:b w:val="false"/>
-        <w:shd w:fill="auto" w:val="clear"/>
+        <w:shd w:val="clear" w:fill="auto"/>
         <w:szCs w:val="22"/>
         <w:iCs w:val="false"/>
         <w:bCs w:val="false"/>
@@ -3179,7 +3218,7 @@
         <w:ind w:left="2160" w:hanging="360"/>
       </w:pPr>
       <w:rPr>
-        <w:rFonts w:ascii="Arial" w:hAnsi="Arial" w:cs="Arial" w:hint="default"/>
+        <w:rFonts w:hint="default" w:ascii="Arial" w:hAnsi="Arial" w:cs="Arial"/>
         <w:smallCaps w:val="false"/>
         <w:caps w:val="false"/>
         <w:dstrike w:val="false"/>
@@ -3191,7 +3230,7 @@
         <w:i w:val="false"/>
         <w:u w:val="none"/>
         <w:b w:val="false"/>
-        <w:shd w:fill="auto" w:val="clear"/>
+        <w:shd w:val="clear" w:fill="auto"/>
         <w:szCs w:val="22"/>
         <w:iCs w:val="false"/>
         <w:bCs w:val="false"/>
@@ -3210,7 +3249,7 @@
         <w:ind w:left="2880" w:hanging="360"/>
       </w:pPr>
       <w:rPr>
-        <w:rFonts w:ascii="Arial" w:hAnsi="Arial" w:cs="Arial" w:hint="default"/>
+        <w:rFonts w:hint="default" w:ascii="Arial" w:hAnsi="Arial" w:cs="Arial"/>
         <w:smallCaps w:val="false"/>
         <w:caps w:val="false"/>
         <w:dstrike w:val="false"/>
@@ -3222,7 +3261,7 @@
         <w:i w:val="false"/>
         <w:u w:val="none"/>
         <w:b w:val="false"/>
-        <w:shd w:fill="auto" w:val="clear"/>
+        <w:shd w:val="clear" w:fill="auto"/>
         <w:szCs w:val="22"/>
         <w:iCs w:val="false"/>
         <w:bCs w:val="false"/>
@@ -3241,7 +3280,7 @@
         <w:ind w:left="3600" w:hanging="360"/>
       </w:pPr>
       <w:rPr>
-        <w:rFonts w:ascii="Arial" w:hAnsi="Arial" w:cs="Arial" w:hint="default"/>
+        <w:rFonts w:hint="default" w:ascii="Arial" w:hAnsi="Arial" w:cs="Arial"/>
         <w:smallCaps w:val="false"/>
         <w:caps w:val="false"/>
         <w:dstrike w:val="false"/>
@@ -3253,7 +3292,7 @@
         <w:i w:val="false"/>
         <w:u w:val="none"/>
         <w:b w:val="false"/>
-        <w:shd w:fill="auto" w:val="clear"/>
+        <w:shd w:val="clear" w:fill="auto"/>
         <w:szCs w:val="22"/>
         <w:iCs w:val="false"/>
         <w:bCs w:val="false"/>
@@ -3272,7 +3311,7 @@
         <w:ind w:left="4320" w:hanging="360"/>
       </w:pPr>
       <w:rPr>
-        <w:rFonts w:ascii="Arial" w:hAnsi="Arial" w:cs="Arial" w:hint="default"/>
+        <w:rFonts w:hint="default" w:ascii="Arial" w:hAnsi="Arial" w:cs="Arial"/>
         <w:smallCaps w:val="false"/>
         <w:caps w:val="false"/>
         <w:dstrike w:val="false"/>
@@ -3284,7 +3323,7 @@
         <w:i w:val="false"/>
         <w:u w:val="none"/>
         <w:b w:val="false"/>
-        <w:shd w:fill="auto" w:val="clear"/>
+        <w:shd w:val="clear" w:fill="auto"/>
         <w:szCs w:val="22"/>
         <w:iCs w:val="false"/>
         <w:bCs w:val="false"/>
@@ -3303,7 +3342,7 @@
         <w:ind w:left="5040" w:hanging="360"/>
       </w:pPr>
       <w:rPr>
-        <w:rFonts w:ascii="Arial" w:hAnsi="Arial" w:cs="Arial" w:hint="default"/>
+        <w:rFonts w:hint="default" w:ascii="Arial" w:hAnsi="Arial" w:cs="Arial"/>
         <w:smallCaps w:val="false"/>
         <w:caps w:val="false"/>
         <w:dstrike w:val="false"/>
@@ -3315,7 +3354,7 @@
         <w:i w:val="false"/>
         <w:u w:val="none"/>
         <w:b w:val="false"/>
-        <w:shd w:fill="auto" w:val="clear"/>
+        <w:shd w:val="clear" w:fill="auto"/>
         <w:szCs w:val="22"/>
         <w:iCs w:val="false"/>
         <w:bCs w:val="false"/>
@@ -3334,7 +3373,7 @@
         <w:ind w:left="5760" w:hanging="360"/>
       </w:pPr>
       <w:rPr>
-        <w:rFonts w:ascii="Arial" w:hAnsi="Arial" w:cs="Arial" w:hint="default"/>
+        <w:rFonts w:hint="default" w:ascii="Arial" w:hAnsi="Arial" w:cs="Arial"/>
         <w:smallCaps w:val="false"/>
         <w:caps w:val="false"/>
         <w:dstrike w:val="false"/>
@@ -3346,7 +3385,7 @@
         <w:i w:val="false"/>
         <w:u w:val="none"/>
         <w:b w:val="false"/>
-        <w:shd w:fill="auto" w:val="clear"/>
+        <w:shd w:val="clear" w:fill="auto"/>
         <w:szCs w:val="22"/>
         <w:iCs w:val="false"/>
         <w:bCs w:val="false"/>
@@ -3365,7 +3404,7 @@
         <w:ind w:left="6480" w:hanging="360"/>
       </w:pPr>
       <w:rPr>
-        <w:rFonts w:ascii="Arial" w:hAnsi="Arial" w:cs="Arial" w:hint="default"/>
+        <w:rFonts w:hint="default" w:ascii="Arial" w:hAnsi="Arial" w:cs="Arial"/>
         <w:smallCaps w:val="false"/>
         <w:caps w:val="false"/>
         <w:dstrike w:val="false"/>
@@ -3377,13 +3416,14 @@
         <w:i w:val="false"/>
         <w:u w:val="none"/>
         <w:b w:val="false"/>
-        <w:shd w:fill="auto" w:val="clear"/>
+        <w:shd w:val="clear" w:fill="auto"/>
         <w:szCs w:val="22"/>
         <w:iCs w:val="false"/>
         <w:bCs w:val="false"/>
         <w:color w:val="000000"/>
       </w:rPr>
     </w:lvl>
+    <w:nsid w:val="1937680"/>
   </w:abstractNum>
   <w:abstractNum w:abstractNumId="3">
     <w:lvl w:ilvl="0">
@@ -3409,7 +3449,7 @@
         <w:i w:val="false"/>
         <w:u w:val="none"/>
         <w:b w:val="false"/>
-        <w:shd w:fill="auto" w:val="clear"/>
+        <w:shd w:val="clear" w:fill="auto"/>
         <w:szCs w:val="22"/>
         <w:iCs w:val="false"/>
         <w:bCs w:val="false"/>
@@ -3440,7 +3480,7 @@
         <w:i w:val="false"/>
         <w:u w:val="none"/>
         <w:b w:val="false"/>
-        <w:shd w:fill="auto" w:val="clear"/>
+        <w:shd w:val="clear" w:fill="auto"/>
         <w:szCs w:val="22"/>
         <w:iCs w:val="false"/>
         <w:bCs w:val="false"/>
@@ -3471,7 +3511,7 @@
         <w:i w:val="false"/>
         <w:u w:val="none"/>
         <w:b w:val="false"/>
-        <w:shd w:fill="auto" w:val="clear"/>
+        <w:shd w:val="clear" w:fill="auto"/>
         <w:szCs w:val="22"/>
         <w:iCs w:val="false"/>
         <w:bCs w:val="false"/>
@@ -3502,7 +3542,7 @@
         <w:i w:val="false"/>
         <w:u w:val="none"/>
         <w:b w:val="false"/>
-        <w:shd w:fill="auto" w:val="clear"/>
+        <w:shd w:val="clear" w:fill="auto"/>
         <w:szCs w:val="22"/>
         <w:iCs w:val="false"/>
         <w:bCs w:val="false"/>
@@ -3533,7 +3573,7 @@
         <w:i w:val="false"/>
         <w:u w:val="none"/>
         <w:b w:val="false"/>
-        <w:shd w:fill="auto" w:val="clear"/>
+        <w:shd w:val="clear" w:fill="auto"/>
         <w:szCs w:val="22"/>
         <w:iCs w:val="false"/>
         <w:bCs w:val="false"/>
@@ -3564,7 +3604,7 @@
         <w:i w:val="false"/>
         <w:u w:val="none"/>
         <w:b w:val="false"/>
-        <w:shd w:fill="auto" w:val="clear"/>
+        <w:shd w:val="clear" w:fill="auto"/>
         <w:szCs w:val="22"/>
         <w:iCs w:val="false"/>
         <w:bCs w:val="false"/>
@@ -3595,7 +3635,7 @@
         <w:i w:val="false"/>
         <w:u w:val="none"/>
         <w:b w:val="false"/>
-        <w:shd w:fill="auto" w:val="clear"/>
+        <w:shd w:val="clear" w:fill="auto"/>
         <w:szCs w:val="22"/>
         <w:iCs w:val="false"/>
         <w:bCs w:val="false"/>
@@ -3626,7 +3666,7 @@
         <w:i w:val="false"/>
         <w:u w:val="none"/>
         <w:b w:val="false"/>
-        <w:shd w:fill="auto" w:val="clear"/>
+        <w:shd w:val="clear" w:fill="auto"/>
         <w:szCs w:val="22"/>
         <w:iCs w:val="false"/>
         <w:bCs w:val="false"/>
@@ -3657,7 +3697,7 @@
         <w:i w:val="false"/>
         <w:u w:val="none"/>
         <w:b w:val="false"/>
-        <w:shd w:fill="auto" w:val="clear"/>
+        <w:shd w:val="clear" w:fill="auto"/>
         <w:szCs w:val="22"/>
         <w:iCs w:val="false"/>
         <w:bCs w:val="false"/>
@@ -3665,6 +3705,7 @@
         <w:color w:val="000000"/>
       </w:rPr>
     </w:lvl>
+    <w:nsid w:val="4f1b0c8c"/>
   </w:abstractNum>
   <w:abstractNum w:abstractNumId="4">
     <w:lvl w:ilvl="0">
@@ -3679,7 +3720,7 @@
         <w:ind w:left="720" w:hanging="360"/>
       </w:pPr>
       <w:rPr>
-        <w:rFonts w:ascii="Arial" w:hAnsi="Arial" w:cs="Arial" w:hint="default"/>
+        <w:rFonts w:hint="default" w:ascii="Arial" w:hAnsi="Arial" w:cs="Arial"/>
         <w:smallCaps w:val="false"/>
         <w:caps w:val="false"/>
         <w:dstrike w:val="false"/>
@@ -3691,7 +3732,7 @@
         <w:i w:val="false"/>
         <w:u w:val="none"/>
         <w:b w:val="false"/>
-        <w:shd w:fill="auto" w:val="clear"/>
+        <w:shd w:val="clear" w:fill="auto"/>
         <w:szCs w:val="22"/>
         <w:iCs w:val="false"/>
         <w:bCs w:val="false"/>
@@ -3710,7 +3751,7 @@
         <w:ind w:left="1440" w:hanging="360"/>
       </w:pPr>
       <w:rPr>
-        <w:rFonts w:ascii="Arial" w:hAnsi="Arial" w:cs="Arial" w:hint="default"/>
+        <w:rFonts w:hint="default" w:ascii="Arial" w:hAnsi="Arial" w:cs="Arial"/>
         <w:smallCaps w:val="false"/>
         <w:caps w:val="false"/>
         <w:dstrike w:val="false"/>
@@ -3722,7 +3763,7 @@
         <w:i w:val="false"/>
         <w:u w:val="none"/>
         <w:b w:val="false"/>
-        <w:shd w:fill="auto" w:val="clear"/>
+        <w:shd w:val="clear" w:fill="auto"/>
         <w:szCs w:val="22"/>
         <w:iCs w:val="false"/>
         <w:bCs w:val="false"/>
@@ -3741,7 +3782,7 @@
         <w:ind w:left="2160" w:hanging="360"/>
       </w:pPr>
       <w:rPr>
-        <w:rFonts w:ascii="Arial" w:hAnsi="Arial" w:cs="Arial" w:hint="default"/>
+        <w:rFonts w:hint="default" w:ascii="Arial" w:hAnsi="Arial" w:cs="Arial"/>
         <w:smallCaps w:val="false"/>
         <w:caps w:val="false"/>
         <w:dstrike w:val="false"/>
@@ -3753,7 +3794,7 @@
         <w:i w:val="false"/>
         <w:u w:val="none"/>
         <w:b w:val="false"/>
-        <w:shd w:fill="auto" w:val="clear"/>
+        <w:shd w:val="clear" w:fill="auto"/>
         <w:szCs w:val="22"/>
         <w:iCs w:val="false"/>
         <w:bCs w:val="false"/>
@@ -3772,7 +3813,7 @@
         <w:ind w:left="2880" w:hanging="360"/>
       </w:pPr>
       <w:rPr>
-        <w:rFonts w:ascii="Arial" w:hAnsi="Arial" w:cs="Arial" w:hint="default"/>
+        <w:rFonts w:hint="default" w:ascii="Arial" w:hAnsi="Arial" w:cs="Arial"/>
         <w:smallCaps w:val="false"/>
         <w:caps w:val="false"/>
         <w:dstrike w:val="false"/>
@@ -3784,7 +3825,7 @@
         <w:i w:val="false"/>
         <w:u w:val="none"/>
         <w:b w:val="false"/>
-        <w:shd w:fill="auto" w:val="clear"/>
+        <w:shd w:val="clear" w:fill="auto"/>
         <w:szCs w:val="22"/>
         <w:iCs w:val="false"/>
         <w:bCs w:val="false"/>
@@ -3803,7 +3844,7 @@
         <w:ind w:left="3600" w:hanging="360"/>
       </w:pPr>
       <w:rPr>
-        <w:rFonts w:ascii="Arial" w:hAnsi="Arial" w:cs="Arial" w:hint="default"/>
+        <w:rFonts w:hint="default" w:ascii="Arial" w:hAnsi="Arial" w:cs="Arial"/>
         <w:smallCaps w:val="false"/>
         <w:caps w:val="false"/>
         <w:dstrike w:val="false"/>
@@ -3815,7 +3856,7 @@
         <w:i w:val="false"/>
         <w:u w:val="none"/>
         <w:b w:val="false"/>
-        <w:shd w:fill="auto" w:val="clear"/>
+        <w:shd w:val="clear" w:fill="auto"/>
         <w:szCs w:val="22"/>
         <w:iCs w:val="false"/>
         <w:bCs w:val="false"/>
@@ -3834,7 +3875,7 @@
         <w:ind w:left="4320" w:hanging="360"/>
       </w:pPr>
       <w:rPr>
-        <w:rFonts w:ascii="Arial" w:hAnsi="Arial" w:cs="Arial" w:hint="default"/>
+        <w:rFonts w:hint="default" w:ascii="Arial" w:hAnsi="Arial" w:cs="Arial"/>
         <w:smallCaps w:val="false"/>
         <w:caps w:val="false"/>
         <w:dstrike w:val="false"/>
@@ -3846,7 +3887,7 @@
         <w:i w:val="false"/>
         <w:u w:val="none"/>
         <w:b w:val="false"/>
-        <w:shd w:fill="auto" w:val="clear"/>
+        <w:shd w:val="clear" w:fill="auto"/>
         <w:szCs w:val="22"/>
         <w:iCs w:val="false"/>
         <w:bCs w:val="false"/>
@@ -3865,7 +3906,7 @@
         <w:ind w:left="5040" w:hanging="360"/>
       </w:pPr>
       <w:rPr>
-        <w:rFonts w:ascii="Arial" w:hAnsi="Arial" w:cs="Arial" w:hint="default"/>
+        <w:rFonts w:hint="default" w:ascii="Arial" w:hAnsi="Arial" w:cs="Arial"/>
         <w:smallCaps w:val="false"/>
         <w:caps w:val="false"/>
         <w:dstrike w:val="false"/>
@@ -3877,7 +3918,7 @@
         <w:i w:val="false"/>
         <w:u w:val="none"/>
         <w:b w:val="false"/>
-        <w:shd w:fill="auto" w:val="clear"/>
+        <w:shd w:val="clear" w:fill="auto"/>
         <w:szCs w:val="22"/>
         <w:iCs w:val="false"/>
         <w:bCs w:val="false"/>
@@ -3896,7 +3937,7 @@
         <w:ind w:left="5760" w:hanging="360"/>
       </w:pPr>
       <w:rPr>
-        <w:rFonts w:ascii="Arial" w:hAnsi="Arial" w:cs="Arial" w:hint="default"/>
+        <w:rFonts w:hint="default" w:ascii="Arial" w:hAnsi="Arial" w:cs="Arial"/>
         <w:smallCaps w:val="false"/>
         <w:caps w:val="false"/>
         <w:dstrike w:val="false"/>
@@ -3908,7 +3949,7 @@
         <w:i w:val="false"/>
         <w:u w:val="none"/>
         <w:b w:val="false"/>
-        <w:shd w:fill="auto" w:val="clear"/>
+        <w:shd w:val="clear" w:fill="auto"/>
         <w:szCs w:val="22"/>
         <w:iCs w:val="false"/>
         <w:bCs w:val="false"/>
@@ -3927,7 +3968,7 @@
         <w:ind w:left="6480" w:hanging="360"/>
       </w:pPr>
       <w:rPr>
-        <w:rFonts w:ascii="Arial" w:hAnsi="Arial" w:cs="Arial" w:hint="default"/>
+        <w:rFonts w:hint="default" w:ascii="Arial" w:hAnsi="Arial" w:cs="Arial"/>
         <w:smallCaps w:val="false"/>
         <w:caps w:val="false"/>
         <w:dstrike w:val="false"/>
@@ -3939,13 +3980,14 @@
         <w:i w:val="false"/>
         <w:u w:val="none"/>
         <w:b w:val="false"/>
-        <w:shd w:fill="auto" w:val="clear"/>
+        <w:shd w:val="clear" w:fill="auto"/>
         <w:szCs w:val="22"/>
         <w:iCs w:val="false"/>
         <w:bCs w:val="false"/>
         <w:color w:val="000000"/>
       </w:rPr>
     </w:lvl>
+    <w:nsid w:val="b00483c"/>
   </w:abstractNum>
   <w:abstractNum w:abstractNumId="5">
     <w:lvl w:ilvl="0">
@@ -3971,7 +4013,7 @@
         <w:i w:val="false"/>
         <w:u w:val="none"/>
         <w:b w:val="false"/>
-        <w:shd w:fill="auto" w:val="clear"/>
+        <w:shd w:val="clear" w:fill="auto"/>
         <w:szCs w:val="22"/>
         <w:iCs w:val="false"/>
         <w:bCs w:val="false"/>
@@ -3991,7 +4033,7 @@
         <w:ind w:left="1440" w:hanging="360"/>
       </w:pPr>
       <w:rPr>
-        <w:rFonts w:ascii="Arial" w:hAnsi="Arial" w:cs="Arial" w:hint="default"/>
+        <w:rFonts w:hint="default" w:ascii="Arial" w:hAnsi="Arial" w:cs="Arial"/>
         <w:smallCaps w:val="false"/>
         <w:caps w:val="false"/>
         <w:dstrike w:val="false"/>
@@ -4003,7 +4045,7 @@
         <w:i w:val="false"/>
         <w:u w:val="none"/>
         <w:b w:val="false"/>
-        <w:shd w:fill="auto" w:val="clear"/>
+        <w:shd w:val="clear" w:fill="auto"/>
         <w:szCs w:val="22"/>
         <w:iCs w:val="false"/>
         <w:bCs w:val="false"/>
@@ -4022,7 +4064,7 @@
         <w:ind w:left="2160" w:hanging="360"/>
       </w:pPr>
       <w:rPr>
-        <w:rFonts w:ascii="Arial" w:hAnsi="Arial" w:cs="Arial" w:hint="default"/>
+        <w:rFonts w:hint="default" w:ascii="Arial" w:hAnsi="Arial" w:cs="Arial"/>
         <w:smallCaps w:val="false"/>
         <w:caps w:val="false"/>
         <w:dstrike w:val="false"/>
@@ -4034,7 +4076,7 @@
         <w:i w:val="false"/>
         <w:u w:val="none"/>
         <w:b w:val="false"/>
-        <w:shd w:fill="auto" w:val="clear"/>
+        <w:shd w:val="clear" w:fill="auto"/>
         <w:szCs w:val="22"/>
         <w:iCs w:val="false"/>
         <w:bCs w:val="false"/>
@@ -4053,7 +4095,7 @@
         <w:ind w:left="2880" w:hanging="360"/>
       </w:pPr>
       <w:rPr>
-        <w:rFonts w:ascii="Arial" w:hAnsi="Arial" w:cs="Arial" w:hint="default"/>
+        <w:rFonts w:hint="default" w:ascii="Arial" w:hAnsi="Arial" w:cs="Arial"/>
         <w:smallCaps w:val="false"/>
         <w:caps w:val="false"/>
         <w:dstrike w:val="false"/>
@@ -4065,7 +4107,7 @@
         <w:i w:val="false"/>
         <w:u w:val="none"/>
         <w:b w:val="false"/>
-        <w:shd w:fill="auto" w:val="clear"/>
+        <w:shd w:val="clear" w:fill="auto"/>
         <w:szCs w:val="22"/>
         <w:iCs w:val="false"/>
         <w:bCs w:val="false"/>
@@ -4084,7 +4126,7 @@
         <w:ind w:left="3600" w:hanging="360"/>
       </w:pPr>
       <w:rPr>
-        <w:rFonts w:ascii="Arial" w:hAnsi="Arial" w:cs="Arial" w:hint="default"/>
+        <w:rFonts w:hint="default" w:ascii="Arial" w:hAnsi="Arial" w:cs="Arial"/>
         <w:smallCaps w:val="false"/>
         <w:caps w:val="false"/>
         <w:dstrike w:val="false"/>
@@ -4096,7 +4138,7 @@
         <w:i w:val="false"/>
         <w:u w:val="none"/>
         <w:b w:val="false"/>
-        <w:shd w:fill="auto" w:val="clear"/>
+        <w:shd w:val="clear" w:fill="auto"/>
         <w:szCs w:val="22"/>
         <w:iCs w:val="false"/>
         <w:bCs w:val="false"/>
@@ -4115,7 +4157,7 @@
         <w:ind w:left="4320" w:hanging="360"/>
       </w:pPr>
       <w:rPr>
-        <w:rFonts w:ascii="Arial" w:hAnsi="Arial" w:cs="Arial" w:hint="default"/>
+        <w:rFonts w:hint="default" w:ascii="Arial" w:hAnsi="Arial" w:cs="Arial"/>
         <w:smallCaps w:val="false"/>
         <w:caps w:val="false"/>
         <w:dstrike w:val="false"/>
@@ -4127,7 +4169,7 @@
         <w:i w:val="false"/>
         <w:u w:val="none"/>
         <w:b w:val="false"/>
-        <w:shd w:fill="auto" w:val="clear"/>
+        <w:shd w:val="clear" w:fill="auto"/>
         <w:szCs w:val="22"/>
         <w:iCs w:val="false"/>
         <w:bCs w:val="false"/>
@@ -4146,7 +4188,7 @@
         <w:ind w:left="5040" w:hanging="360"/>
       </w:pPr>
       <w:rPr>
-        <w:rFonts w:ascii="Arial" w:hAnsi="Arial" w:cs="Arial" w:hint="default"/>
+        <w:rFonts w:hint="default" w:ascii="Arial" w:hAnsi="Arial" w:cs="Arial"/>
         <w:smallCaps w:val="false"/>
         <w:caps w:val="false"/>
         <w:dstrike w:val="false"/>
@@ -4158,7 +4200,7 @@
         <w:i w:val="false"/>
         <w:u w:val="none"/>
         <w:b w:val="false"/>
-        <w:shd w:fill="auto" w:val="clear"/>
+        <w:shd w:val="clear" w:fill="auto"/>
         <w:szCs w:val="22"/>
         <w:iCs w:val="false"/>
         <w:bCs w:val="false"/>
@@ -4177,7 +4219,7 @@
         <w:ind w:left="5760" w:hanging="360"/>
       </w:pPr>
       <w:rPr>
-        <w:rFonts w:ascii="Arial" w:hAnsi="Arial" w:cs="Arial" w:hint="default"/>
+        <w:rFonts w:hint="default" w:ascii="Arial" w:hAnsi="Arial" w:cs="Arial"/>
         <w:smallCaps w:val="false"/>
         <w:caps w:val="false"/>
         <w:dstrike w:val="false"/>
@@ -4189,7 +4231,7 @@
         <w:i w:val="false"/>
         <w:u w:val="none"/>
         <w:b w:val="false"/>
-        <w:shd w:fill="auto" w:val="clear"/>
+        <w:shd w:val="clear" w:fill="auto"/>
         <w:szCs w:val="22"/>
         <w:iCs w:val="false"/>
         <w:bCs w:val="false"/>
@@ -4208,7 +4250,7 @@
         <w:ind w:left="6480" w:hanging="360"/>
       </w:pPr>
       <w:rPr>
-        <w:rFonts w:ascii="Arial" w:hAnsi="Arial" w:cs="Arial" w:hint="default"/>
+        <w:rFonts w:hint="default" w:ascii="Arial" w:hAnsi="Arial" w:cs="Arial"/>
         <w:smallCaps w:val="false"/>
         <w:caps w:val="false"/>
         <w:dstrike w:val="false"/>
@@ -4220,13 +4262,14 @@
         <w:i w:val="false"/>
         <w:u w:val="none"/>
         <w:b w:val="false"/>
-        <w:shd w:fill="auto" w:val="clear"/>
+        <w:shd w:val="clear" w:fill="auto"/>
         <w:szCs w:val="22"/>
         <w:iCs w:val="false"/>
         <w:bCs w:val="false"/>
         <w:color w:val="000000"/>
       </w:rPr>
     </w:lvl>
+    <w:nsid w:val="713eeb6d"/>
   </w:abstractNum>
   <w:abstractNum w:abstractNumId="6">
     <w:lvl w:ilvl="0">
@@ -4346,6 +4389,7 @@
         <w:ind w:left="0" w:hanging="0"/>
       </w:pPr>
     </w:lvl>
+    <w:nsid w:val="51937f1a"/>
   </w:abstractNum>
   <w:num w:numId="1">
     <w:abstractNumId w:val="1"/>
@@ -4369,7 +4413,7 @@
 </file>
 
 <file path=word/styles.xml><?xml version="1.0" encoding="utf-8"?>
-<w:styles xmlns:w="http://schemas.openxmlformats.org/wordprocessingml/2006/main" xmlns:w14="http://schemas.microsoft.com/office/word/2010/wordml" xmlns:mc="http://schemas.openxmlformats.org/markup-compatibility/2006" mc:Ignorable="w14">
+<w:styles xmlns:wp14="http://schemas.microsoft.com/office/word/2010/wordprocessingDrawing" xmlns:w="http://schemas.openxmlformats.org/wordprocessingml/2006/main" xmlns:w14="http://schemas.microsoft.com/office/word/2010/wordml" xmlns:mc="http://schemas.openxmlformats.org/markup-compatibility/2006" mc:Ignorable="w14 wp14">
   <w:docDefaults>
     <w:rPrDefault>
       <w:rPr>
@@ -4392,7 +4436,7 @@
     <w:pPr>
       <w:widowControl/>
       <w:bidi w:val="0"/>
-      <w:spacing w:lineRule="auto" w:line="333" w:before="0" w:after="0"/>
+      <w:spacing w:before="0" w:after="0" w:line="333" w:lineRule="auto"/>
       <w:jc w:val="left"/>
     </w:pPr>
     <w:rPr>
@@ -4405,7 +4449,7 @@
     </w:rPr>
   </w:style>
   <w:style w:type="paragraph" w:styleId="Heading1">
-    <w:name w:val="Heading 1"/>
+    <w:name w:val="heading 1"/>
     <w:basedOn w:val="normal1"/>
     <w:next w:val="normal1"/>
     <w:qFormat/>
@@ -4413,7 +4457,7 @@
       <w:keepNext w:val="true"/>
       <w:keepLines/>
       <w:pageBreakBefore w:val="false"/>
-      <w:spacing w:lineRule="auto" w:line="288" w:before="480" w:after="120"/>
+      <w:spacing w:before="480" w:after="120" w:line="288" w:lineRule="auto"/>
     </w:pPr>
     <w:rPr>
       <w:rFonts w:ascii="Inter" w:hAnsi="Inter" w:eastAsia="Inter" w:cs="Inter"/>
@@ -4427,7 +4471,7 @@
     </w:rPr>
   </w:style>
   <w:style w:type="paragraph" w:styleId="Heading2">
-    <w:name w:val="Heading 2"/>
+    <w:name w:val="heading 2"/>
     <w:basedOn w:val="normal1"/>
     <w:next w:val="normal1"/>
     <w:qFormat/>
@@ -4435,7 +4479,7 @@
       <w:keepNext w:val="true"/>
       <w:keepLines/>
       <w:pageBreakBefore w:val="false"/>
-      <w:spacing w:lineRule="auto" w:line="300" w:before="360" w:after="80"/>
+      <w:spacing w:before="360" w:after="80" w:line="300" w:lineRule="auto"/>
     </w:pPr>
     <w:rPr>
       <w:rFonts w:ascii="Inter" w:hAnsi="Inter" w:eastAsia="Inter" w:cs="Inter"/>
@@ -4449,7 +4493,7 @@
     </w:rPr>
   </w:style>
   <w:style w:type="paragraph" w:styleId="Heading3">
-    <w:name w:val="Heading 3"/>
+    <w:name w:val="heading 3"/>
     <w:basedOn w:val="normal1"/>
     <w:next w:val="normal1"/>
     <w:qFormat/>
@@ -4457,7 +4501,7 @@
       <w:keepNext w:val="true"/>
       <w:keepLines/>
       <w:pageBreakBefore w:val="false"/>
-      <w:spacing w:lineRule="auto" w:line="300" w:before="280" w:after="80"/>
+      <w:spacing w:before="280" w:after="80" w:line="300" w:lineRule="auto"/>
     </w:pPr>
     <w:rPr>
       <w:rFonts w:ascii="Inter" w:hAnsi="Inter" w:eastAsia="Inter" w:cs="Inter"/>
@@ -4471,7 +4515,7 @@
     </w:rPr>
   </w:style>
   <w:style w:type="paragraph" w:styleId="Heading4">
-    <w:name w:val="Heading 4"/>
+    <w:name w:val="heading 4"/>
     <w:basedOn w:val="normal1"/>
     <w:next w:val="normal1"/>
     <w:qFormat/>
@@ -4479,7 +4523,7 @@
       <w:keepNext w:val="true"/>
       <w:keepLines/>
       <w:pageBreakBefore w:val="false"/>
-      <w:spacing w:lineRule="auto" w:line="240" w:before="240" w:after="40"/>
+      <w:spacing w:before="240" w:after="40" w:line="240" w:lineRule="auto"/>
     </w:pPr>
     <w:rPr>
       <w:b/>
@@ -4489,7 +4533,7 @@
     </w:rPr>
   </w:style>
   <w:style w:type="paragraph" w:styleId="Heading5">
-    <w:name w:val="Heading 5"/>
+    <w:name w:val="heading 5"/>
     <w:basedOn w:val="normal1"/>
     <w:next w:val="normal1"/>
     <w:qFormat/>
@@ -4497,7 +4541,7 @@
       <w:keepNext w:val="true"/>
       <w:keepLines/>
       <w:pageBreakBefore w:val="false"/>
-      <w:spacing w:lineRule="auto" w:line="240" w:before="220" w:after="40"/>
+      <w:spacing w:before="220" w:after="40" w:line="240" w:lineRule="auto"/>
     </w:pPr>
     <w:rPr>
       <w:b/>
@@ -4507,7 +4551,7 @@
     </w:rPr>
   </w:style>
   <w:style w:type="paragraph" w:styleId="Heading6">
-    <w:name w:val="Heading 6"/>
+    <w:name w:val="heading 6"/>
     <w:basedOn w:val="normal1"/>
     <w:next w:val="normal1"/>
     <w:qFormat/>
@@ -4515,7 +4559,7 @@
       <w:keepNext w:val="true"/>
       <w:keepLines/>
       <w:pageBreakBefore w:val="false"/>
-      <w:spacing w:lineRule="auto" w:line="240" w:before="200" w:after="40"/>
+      <w:spacing w:before="200" w:after="40" w:line="240" w:lineRule="auto"/>
     </w:pPr>
     <w:rPr>
       <w:b/>
@@ -4543,7 +4587,7 @@
     <w:name w:val="Body Text"/>
     <w:basedOn w:val="Normal"/>
     <w:pPr>
-      <w:spacing w:lineRule="auto" w:line="276" w:before="0" w:after="140"/>
+      <w:spacing w:before="0" w:after="140" w:line="276" w:lineRule="auto"/>
     </w:pPr>
     <w:rPr/>
   </w:style>
@@ -4588,7 +4632,7 @@
     <w:pPr>
       <w:widowControl/>
       <w:bidi w:val="0"/>
-      <w:spacing w:lineRule="auto" w:line="333" w:before="0" w:after="0"/>
+      <w:spacing w:before="0" w:after="0" w:line="333" w:lineRule="auto"/>
       <w:jc w:val="left"/>
     </w:pPr>
     <w:rPr>
@@ -4609,7 +4653,7 @@
       <w:keepNext w:val="true"/>
       <w:keepLines/>
       <w:pageBreakBefore w:val="false"/>
-      <w:spacing w:lineRule="auto" w:line="276" w:before="480" w:after="120"/>
+      <w:spacing w:before="480" w:after="120" w:line="276" w:lineRule="auto"/>
     </w:pPr>
     <w:rPr>
       <w:rFonts w:ascii="Inter" w:hAnsi="Inter" w:eastAsia="Inter" w:cs="Inter"/>
@@ -4631,7 +4675,7 @@
       <w:keepNext w:val="true"/>
       <w:keepLines/>
       <w:pageBreakBefore w:val="false"/>
-      <w:spacing w:lineRule="auto" w:line="300" w:before="360" w:after="80"/>
+      <w:spacing w:before="360" w:after="80" w:line="300" w:lineRule="auto"/>
     </w:pPr>
     <w:rPr>
       <w:rFonts w:ascii="Inter" w:hAnsi="Inter" w:eastAsia="Inter" w:cs="Inter"/>
@@ -4644,8 +4688,8 @@
       <w:szCs w:val="28"/>
     </w:rPr>
   </w:style>
-  <w:style w:type="table" w:default="1" w:styleId="TableNormal">
-    <w:name w:val="TableNormal"/>
+  <w:style w:type="table" w:styleId="TableNormal" w:default="1">
+    <w:name w:val="Normal Table"/>
     <w:tblPr>
       <w:tblCellMar>
         <w:top w:w="100" w:type="dxa"/>

</xml_diff>